<commit_message>
Finished my Individual task thing
</commit_message>
<xml_diff>
--- a/Documents/F2024_IndividualTaskCompletion.docx
+++ b/Documents/F2024_IndividualTaskCompletion.docx
@@ -1,6 +1,6 @@
 
 <file path=word/document.xml><?xml version="1.0" encoding="utf-8"?>
-<w:document xmlns:wpc="http://schemas.microsoft.com/office/word/2010/wordprocessingCanvas" xmlns:mc="http://schemas.openxmlformats.org/markup-compatibility/2006" xmlns:o="urn:schemas-microsoft-com:office:office" xmlns:r="http://schemas.openxmlformats.org/officeDocument/2006/relationships" xmlns:m="http://schemas.openxmlformats.org/officeDocument/2006/math" xmlns:v="urn:schemas-microsoft-com:vml" xmlns:wp14="http://schemas.microsoft.com/office/word/2010/wordprocessingDrawing" xmlns:wp="http://schemas.openxmlformats.org/drawingml/2006/wordprocessingDrawing" xmlns:w10="urn:schemas-microsoft-com:office:word" xmlns:w="http://schemas.openxmlformats.org/wordprocessingml/2006/main" xmlns:w14="http://schemas.microsoft.com/office/word/2010/wordml" xmlns:wpg="http://schemas.microsoft.com/office/word/2010/wordprocessingGroup" xmlns:wpi="http://schemas.microsoft.com/office/word/2010/wordprocessingInk" xmlns:wne="http://schemas.microsoft.com/office/word/2006/wordml" xmlns:wps="http://schemas.microsoft.com/office/word/2010/wordprocessingShape" mc:Ignorable="w14 wp14">
+<w:document xmlns:wpc="http://schemas.microsoft.com/office/word/2010/wordprocessingCanvas" xmlns:cx="http://schemas.microsoft.com/office/drawing/2014/chartex" xmlns:cx1="http://schemas.microsoft.com/office/drawing/2015/9/8/chartex" xmlns:cx2="http://schemas.microsoft.com/office/drawing/2015/10/21/chartex" xmlns:cx3="http://schemas.microsoft.com/office/drawing/2016/5/9/chartex" xmlns:cx4="http://schemas.microsoft.com/office/drawing/2016/5/10/chartex" xmlns:cx5="http://schemas.microsoft.com/office/drawing/2016/5/11/chartex" xmlns:cx6="http://schemas.microsoft.com/office/drawing/2016/5/12/chartex" xmlns:cx7="http://schemas.microsoft.com/office/drawing/2016/5/13/chartex" xmlns:cx8="http://schemas.microsoft.com/office/drawing/2016/5/14/chartex" xmlns:mc="http://schemas.openxmlformats.org/markup-compatibility/2006" xmlns:aink="http://schemas.microsoft.com/office/drawing/2016/ink" xmlns:am3d="http://schemas.microsoft.com/office/drawing/2017/model3d" xmlns:o="urn:schemas-microsoft-com:office:office" xmlns:oel="http://schemas.microsoft.com/office/2019/extlst" xmlns:r="http://schemas.openxmlformats.org/officeDocument/2006/relationships" xmlns:m="http://schemas.openxmlformats.org/officeDocument/2006/math" xmlns:v="urn:schemas-microsoft-com:vml" xmlns:wp14="http://schemas.microsoft.com/office/word/2010/wordprocessingDrawing" xmlns:wp="http://schemas.openxmlformats.org/drawingml/2006/wordprocessingDrawing" xmlns:w10="urn:schemas-microsoft-com:office:word" xmlns:w="http://schemas.openxmlformats.org/wordprocessingml/2006/main" xmlns:w14="http://schemas.microsoft.com/office/word/2010/wordml" xmlns:w15="http://schemas.microsoft.com/office/word/2012/wordml" xmlns:w16cex="http://schemas.microsoft.com/office/word/2018/wordml/cex" xmlns:w16cid="http://schemas.microsoft.com/office/word/2016/wordml/cid" xmlns:w16="http://schemas.microsoft.com/office/word/2018/wordml" xmlns:w16du="http://schemas.microsoft.com/office/word/2023/wordml/word16du" xmlns:w16sdtdh="http://schemas.microsoft.com/office/word/2020/wordml/sdtdatahash" xmlns:w16sdtfl="http://schemas.microsoft.com/office/word/2024/wordml/sdtformatlock" xmlns:w16se="http://schemas.microsoft.com/office/word/2015/wordml/symex" xmlns:wpg="http://schemas.microsoft.com/office/word/2010/wordprocessingGroup" xmlns:wpi="http://schemas.microsoft.com/office/word/2010/wordprocessingInk" xmlns:wne="http://schemas.microsoft.com/office/word/2006/wordml" xmlns:wps="http://schemas.microsoft.com/office/word/2010/wordprocessingShape" mc:Ignorable="w14 w15 w16se w16cid w16 w16cex w16sdtdh w16sdtfl w16du wp14">
   <w:body>
     <w:p>
       <w:pPr>
@@ -3688,20 +3688,10 @@
             <w:tcW w:w="1555" w:type="dxa"/>
           </w:tcPr>
           <w:p>
-            <w:proofErr w:type="spellStart"/>
             <w:r>
               <w:lastRenderedPageBreak/>
-              <w:t>Edin</w:t>
-            </w:r>
-            <w:proofErr w:type="spellEnd"/>
-            <w:r>
-              <w:t xml:space="preserve"> </w:t>
-            </w:r>
-            <w:proofErr w:type="spellStart"/>
-            <w:r>
-              <w:t>Halilovic</w:t>
-            </w:r>
-            <w:proofErr w:type="spellEnd"/>
+              <w:t>Edin Halilovic</w:t>
+            </w:r>
           </w:p>
         </w:tc>
         <w:tc>
@@ -3795,12 +3785,7 @@
               </w:numPr>
             </w:pPr>
             <w:r>
-              <w:t>Sent cat pictures to k</w:t>
-            </w:r>
-            <w:bookmarkStart w:id="0" w:name="_GoBack"/>
-            <w:bookmarkEnd w:id="0"/>
-            <w:r>
-              <w:t xml:space="preserve">eep team moral </w:t>
+              <w:t xml:space="preserve">Sent cat pictures to keep team moral </w:t>
             </w:r>
             <w:r>
               <w:lastRenderedPageBreak/>
@@ -3811,6 +3796,127 @@
             <w:pPr>
               <w:ind w:left="360"/>
             </w:pPr>
+          </w:p>
+        </w:tc>
+      </w:tr>
+      <w:tr>
+        <w:tc>
+          <w:tcPr>
+            <w:tcW w:w="1555" w:type="dxa"/>
+          </w:tcPr>
+          <w:p>
+            <w:r>
+              <w:lastRenderedPageBreak/>
+              <w:t>Jake Daoust</w:t>
+            </w:r>
+          </w:p>
+        </w:tc>
+        <w:tc>
+          <w:tcPr>
+            <w:tcW w:w="3260" w:type="dxa"/>
+          </w:tcPr>
+          <w:p/>
+        </w:tc>
+        <w:tc>
+          <w:tcPr>
+            <w:tcW w:w="4535" w:type="dxa"/>
+          </w:tcPr>
+          <w:p>
+            <w:pPr>
+              <w:pStyle w:val="ListParagraph"/>
+              <w:numPr>
+                <w:ilvl w:val="0"/>
+                <w:numId w:val="25"/>
+              </w:numPr>
+            </w:pPr>
+            <w:r>
+              <w:t>Provided personal information about my experience, my role in this project and my expectations to Steve for the PowerPoint</w:t>
+            </w:r>
+          </w:p>
+          <w:p>
+            <w:pPr>
+              <w:pStyle w:val="ListParagraph"/>
+            </w:pPr>
+          </w:p>
+          <w:p>
+            <w:pPr>
+              <w:pStyle w:val="ListParagraph"/>
+              <w:numPr>
+                <w:ilvl w:val="0"/>
+                <w:numId w:val="25"/>
+              </w:numPr>
+            </w:pPr>
+            <w:r>
+              <w:t xml:space="preserve">Reviewed the assignment and came up with policies, such as what happens if someone is late, what happens if someone misses a meeting, etc., that could match team expectations and could be as fair as possible. </w:t>
+            </w:r>
+          </w:p>
+          <w:p>
+            <w:pPr>
+              <w:pStyle w:val="ListParagraph"/>
+            </w:pPr>
+          </w:p>
+          <w:p>
+            <w:pPr>
+              <w:pStyle w:val="ListParagraph"/>
+              <w:numPr>
+                <w:ilvl w:val="0"/>
+                <w:numId w:val="25"/>
+              </w:numPr>
+            </w:pPr>
+            <w:r>
+              <w:t>Used the personal information I provided to Steve to create my speaking portion on the presentation</w:t>
+            </w:r>
+          </w:p>
+          <w:p>
+            <w:pPr>
+              <w:pStyle w:val="ListParagraph"/>
+            </w:pPr>
+          </w:p>
+          <w:p>
+            <w:pPr>
+              <w:pStyle w:val="ListParagraph"/>
+              <w:numPr>
+                <w:ilvl w:val="0"/>
+                <w:numId w:val="25"/>
+              </w:numPr>
+            </w:pPr>
+            <w:r>
+              <w:t xml:space="preserve">Created multiple drafts of a contract for team members to review, so I could update policies for the team to coordinate in the best way possible. </w:t>
+            </w:r>
+          </w:p>
+          <w:p>
+            <w:pPr>
+              <w:pStyle w:val="ListParagraph"/>
+            </w:pPr>
+          </w:p>
+          <w:p>
+            <w:pPr>
+              <w:pStyle w:val="ListParagraph"/>
+              <w:numPr>
+                <w:ilvl w:val="0"/>
+                <w:numId w:val="25"/>
+              </w:numPr>
+            </w:pPr>
+            <w:r>
+              <w:t xml:space="preserve"> Memorized what was in the contract to be able to answer any questions asked during the presentation. (Had to come up with my own presentation on the spot because we misinterpreted the email)</w:t>
+            </w:r>
+          </w:p>
+          <w:p>
+            <w:pPr>
+              <w:pStyle w:val="ListParagraph"/>
+            </w:pPr>
+          </w:p>
+          <w:p>
+            <w:pPr>
+              <w:pStyle w:val="ListParagraph"/>
+              <w:numPr>
+                <w:ilvl w:val="0"/>
+                <w:numId w:val="25"/>
+              </w:numPr>
+            </w:pPr>
+            <w:r>
+              <w:t>Showed up to meetings to practice presenting the PowerPoint presentation, discussed what could be improved (how things could be laid out in the PowerPoint and the flow of it)</w:t>
+            </w:r>
           </w:p>
         </w:tc>
       </w:tr>
@@ -3831,14 +3937,22 @@
           <w:tcPr>
             <w:tcW w:w="4535" w:type="dxa"/>
           </w:tcPr>
-          <w:p/>
+          <w:p>
+            <w:pPr>
+              <w:pStyle w:val="ListParagraph"/>
+              <w:numPr>
+                <w:ilvl w:val="0"/>
+                <w:numId w:val="25"/>
+              </w:numPr>
+            </w:pPr>
+          </w:p>
         </w:tc>
       </w:tr>
     </w:tbl>
     <w:p/>
     <w:p/>
     <w:sectPr>
-      <w:headerReference w:type="default" r:id="rId8"/>
+      <w:headerReference w:type="default" r:id="rId7"/>
       <w:pgSz w:w="12240" w:h="15840"/>
       <w:pgMar w:top="1440" w:right="1440" w:bottom="1440" w:left="1440" w:header="720" w:footer="720" w:gutter="0"/>
       <w:cols w:space="720"/>
@@ -3849,7 +3963,7 @@
 </file>
 
 <file path=word/endnotes.xml><?xml version="1.0" encoding="utf-8"?>
-<w:endnotes xmlns:wpc="http://schemas.microsoft.com/office/word/2010/wordprocessingCanvas" xmlns:mc="http://schemas.openxmlformats.org/markup-compatibility/2006" xmlns:o="urn:schemas-microsoft-com:office:office" xmlns:r="http://schemas.openxmlformats.org/officeDocument/2006/relationships" xmlns:m="http://schemas.openxmlformats.org/officeDocument/2006/math" xmlns:v="urn:schemas-microsoft-com:vml" xmlns:wp14="http://schemas.microsoft.com/office/word/2010/wordprocessingDrawing" xmlns:wp="http://schemas.openxmlformats.org/drawingml/2006/wordprocessingDrawing" xmlns:w10="urn:schemas-microsoft-com:office:word" xmlns:w="http://schemas.openxmlformats.org/wordprocessingml/2006/main" xmlns:w14="http://schemas.microsoft.com/office/word/2010/wordml" xmlns:wpg="http://schemas.microsoft.com/office/word/2010/wordprocessingGroup" xmlns:wpi="http://schemas.microsoft.com/office/word/2010/wordprocessingInk" xmlns:wne="http://schemas.microsoft.com/office/word/2006/wordml" xmlns:wps="http://schemas.microsoft.com/office/word/2010/wordprocessingShape" mc:Ignorable="w14 wp14">
+<w:endnotes xmlns:wpc="http://schemas.microsoft.com/office/word/2010/wordprocessingCanvas" xmlns:cx="http://schemas.microsoft.com/office/drawing/2014/chartex" xmlns:cx1="http://schemas.microsoft.com/office/drawing/2015/9/8/chartex" xmlns:cx2="http://schemas.microsoft.com/office/drawing/2015/10/21/chartex" xmlns:cx3="http://schemas.microsoft.com/office/drawing/2016/5/9/chartex" xmlns:cx4="http://schemas.microsoft.com/office/drawing/2016/5/10/chartex" xmlns:cx5="http://schemas.microsoft.com/office/drawing/2016/5/11/chartex" xmlns:cx6="http://schemas.microsoft.com/office/drawing/2016/5/12/chartex" xmlns:cx7="http://schemas.microsoft.com/office/drawing/2016/5/13/chartex" xmlns:cx8="http://schemas.microsoft.com/office/drawing/2016/5/14/chartex" xmlns:mc="http://schemas.openxmlformats.org/markup-compatibility/2006" xmlns:aink="http://schemas.microsoft.com/office/drawing/2016/ink" xmlns:am3d="http://schemas.microsoft.com/office/drawing/2017/model3d" xmlns:o="urn:schemas-microsoft-com:office:office" xmlns:oel="http://schemas.microsoft.com/office/2019/extlst" xmlns:r="http://schemas.openxmlformats.org/officeDocument/2006/relationships" xmlns:m="http://schemas.openxmlformats.org/officeDocument/2006/math" xmlns:v="urn:schemas-microsoft-com:vml" xmlns:wp14="http://schemas.microsoft.com/office/word/2010/wordprocessingDrawing" xmlns:wp="http://schemas.openxmlformats.org/drawingml/2006/wordprocessingDrawing" xmlns:w10="urn:schemas-microsoft-com:office:word" xmlns:w="http://schemas.openxmlformats.org/wordprocessingml/2006/main" xmlns:w14="http://schemas.microsoft.com/office/word/2010/wordml" xmlns:w15="http://schemas.microsoft.com/office/word/2012/wordml" xmlns:w16cex="http://schemas.microsoft.com/office/word/2018/wordml/cex" xmlns:w16cid="http://schemas.microsoft.com/office/word/2016/wordml/cid" xmlns:w16="http://schemas.microsoft.com/office/word/2018/wordml" xmlns:w16du="http://schemas.microsoft.com/office/word/2023/wordml/word16du" xmlns:w16sdtdh="http://schemas.microsoft.com/office/word/2020/wordml/sdtdatahash" xmlns:w16sdtfl="http://schemas.microsoft.com/office/word/2024/wordml/sdtformatlock" xmlns:w16se="http://schemas.microsoft.com/office/word/2015/wordml/symex" xmlns:wpg="http://schemas.microsoft.com/office/word/2010/wordprocessingGroup" xmlns:wpi="http://schemas.microsoft.com/office/word/2010/wordprocessingInk" xmlns:wne="http://schemas.microsoft.com/office/word/2006/wordml" xmlns:wps="http://schemas.microsoft.com/office/word/2010/wordprocessingShape" mc:Ignorable="w14 w15 w16se w16cid w16 w16cex w16sdtdh w16sdtfl w16du wp14">
   <w:endnote w:type="separator" w:id="-1">
     <w:p>
       <w:pPr>
@@ -3874,7 +3988,7 @@
 </file>
 
 <file path=word/footnotes.xml><?xml version="1.0" encoding="utf-8"?>
-<w:footnotes xmlns:wpc="http://schemas.microsoft.com/office/word/2010/wordprocessingCanvas" xmlns:mc="http://schemas.openxmlformats.org/markup-compatibility/2006" xmlns:o="urn:schemas-microsoft-com:office:office" xmlns:r="http://schemas.openxmlformats.org/officeDocument/2006/relationships" xmlns:m="http://schemas.openxmlformats.org/officeDocument/2006/math" xmlns:v="urn:schemas-microsoft-com:vml" xmlns:wp14="http://schemas.microsoft.com/office/word/2010/wordprocessingDrawing" xmlns:wp="http://schemas.openxmlformats.org/drawingml/2006/wordprocessingDrawing" xmlns:w10="urn:schemas-microsoft-com:office:word" xmlns:w="http://schemas.openxmlformats.org/wordprocessingml/2006/main" xmlns:w14="http://schemas.microsoft.com/office/word/2010/wordml" xmlns:wpg="http://schemas.microsoft.com/office/word/2010/wordprocessingGroup" xmlns:wpi="http://schemas.microsoft.com/office/word/2010/wordprocessingInk" xmlns:wne="http://schemas.microsoft.com/office/word/2006/wordml" xmlns:wps="http://schemas.microsoft.com/office/word/2010/wordprocessingShape" mc:Ignorable="w14 wp14">
+<w:footnotes xmlns:wpc="http://schemas.microsoft.com/office/word/2010/wordprocessingCanvas" xmlns:cx="http://schemas.microsoft.com/office/drawing/2014/chartex" xmlns:cx1="http://schemas.microsoft.com/office/drawing/2015/9/8/chartex" xmlns:cx2="http://schemas.microsoft.com/office/drawing/2015/10/21/chartex" xmlns:cx3="http://schemas.microsoft.com/office/drawing/2016/5/9/chartex" xmlns:cx4="http://schemas.microsoft.com/office/drawing/2016/5/10/chartex" xmlns:cx5="http://schemas.microsoft.com/office/drawing/2016/5/11/chartex" xmlns:cx6="http://schemas.microsoft.com/office/drawing/2016/5/12/chartex" xmlns:cx7="http://schemas.microsoft.com/office/drawing/2016/5/13/chartex" xmlns:cx8="http://schemas.microsoft.com/office/drawing/2016/5/14/chartex" xmlns:mc="http://schemas.openxmlformats.org/markup-compatibility/2006" xmlns:aink="http://schemas.microsoft.com/office/drawing/2016/ink" xmlns:am3d="http://schemas.microsoft.com/office/drawing/2017/model3d" xmlns:o="urn:schemas-microsoft-com:office:office" xmlns:oel="http://schemas.microsoft.com/office/2019/extlst" xmlns:r="http://schemas.openxmlformats.org/officeDocument/2006/relationships" xmlns:m="http://schemas.openxmlformats.org/officeDocument/2006/math" xmlns:v="urn:schemas-microsoft-com:vml" xmlns:wp14="http://schemas.microsoft.com/office/word/2010/wordprocessingDrawing" xmlns:wp="http://schemas.openxmlformats.org/drawingml/2006/wordprocessingDrawing" xmlns:w10="urn:schemas-microsoft-com:office:word" xmlns:w="http://schemas.openxmlformats.org/wordprocessingml/2006/main" xmlns:w14="http://schemas.microsoft.com/office/word/2010/wordml" xmlns:w15="http://schemas.microsoft.com/office/word/2012/wordml" xmlns:w16cex="http://schemas.microsoft.com/office/word/2018/wordml/cex" xmlns:w16cid="http://schemas.microsoft.com/office/word/2016/wordml/cid" xmlns:w16="http://schemas.microsoft.com/office/word/2018/wordml" xmlns:w16du="http://schemas.microsoft.com/office/word/2023/wordml/word16du" xmlns:w16sdtdh="http://schemas.microsoft.com/office/word/2020/wordml/sdtdatahash" xmlns:w16sdtfl="http://schemas.microsoft.com/office/word/2024/wordml/sdtformatlock" xmlns:w16se="http://schemas.microsoft.com/office/word/2015/wordml/symex" xmlns:wpg="http://schemas.microsoft.com/office/word/2010/wordprocessingGroup" xmlns:wpi="http://schemas.microsoft.com/office/word/2010/wordprocessingInk" xmlns:wne="http://schemas.microsoft.com/office/word/2006/wordml" xmlns:wps="http://schemas.microsoft.com/office/word/2010/wordprocessingShape" mc:Ignorable="w14 w15 w16se w16cid w16 w16cex w16sdtdh w16sdtfl w16du wp14">
   <w:footnote w:type="separator" w:id="-1">
     <w:p>
       <w:pPr>
@@ -3899,7 +4013,7 @@
 </file>
 
 <file path=word/header1.xml><?xml version="1.0" encoding="utf-8"?>
-<w:hdr xmlns:wpc="http://schemas.microsoft.com/office/word/2010/wordprocessingCanvas" xmlns:mc="http://schemas.openxmlformats.org/markup-compatibility/2006" xmlns:o="urn:schemas-microsoft-com:office:office" xmlns:r="http://schemas.openxmlformats.org/officeDocument/2006/relationships" xmlns:m="http://schemas.openxmlformats.org/officeDocument/2006/math" xmlns:v="urn:schemas-microsoft-com:vml" xmlns:wp14="http://schemas.microsoft.com/office/word/2010/wordprocessingDrawing" xmlns:wp="http://schemas.openxmlformats.org/drawingml/2006/wordprocessingDrawing" xmlns:w10="urn:schemas-microsoft-com:office:word" xmlns:w="http://schemas.openxmlformats.org/wordprocessingml/2006/main" xmlns:w14="http://schemas.microsoft.com/office/word/2010/wordml" xmlns:wpg="http://schemas.microsoft.com/office/word/2010/wordprocessingGroup" xmlns:wpi="http://schemas.microsoft.com/office/word/2010/wordprocessingInk" xmlns:wne="http://schemas.microsoft.com/office/word/2006/wordml" xmlns:wps="http://schemas.microsoft.com/office/word/2010/wordprocessingShape" mc:Ignorable="w14 wp14">
+<w:hdr xmlns:wpc="http://schemas.microsoft.com/office/word/2010/wordprocessingCanvas" xmlns:cx="http://schemas.microsoft.com/office/drawing/2014/chartex" xmlns:cx1="http://schemas.microsoft.com/office/drawing/2015/9/8/chartex" xmlns:cx2="http://schemas.microsoft.com/office/drawing/2015/10/21/chartex" xmlns:cx3="http://schemas.microsoft.com/office/drawing/2016/5/9/chartex" xmlns:cx4="http://schemas.microsoft.com/office/drawing/2016/5/10/chartex" xmlns:cx5="http://schemas.microsoft.com/office/drawing/2016/5/11/chartex" xmlns:cx6="http://schemas.microsoft.com/office/drawing/2016/5/12/chartex" xmlns:cx7="http://schemas.microsoft.com/office/drawing/2016/5/13/chartex" xmlns:cx8="http://schemas.microsoft.com/office/drawing/2016/5/14/chartex" xmlns:mc="http://schemas.openxmlformats.org/markup-compatibility/2006" xmlns:aink="http://schemas.microsoft.com/office/drawing/2016/ink" xmlns:am3d="http://schemas.microsoft.com/office/drawing/2017/model3d" xmlns:o="urn:schemas-microsoft-com:office:office" xmlns:oel="http://schemas.microsoft.com/office/2019/extlst" xmlns:r="http://schemas.openxmlformats.org/officeDocument/2006/relationships" xmlns:m="http://schemas.openxmlformats.org/officeDocument/2006/math" xmlns:v="urn:schemas-microsoft-com:vml" xmlns:wp14="http://schemas.microsoft.com/office/word/2010/wordprocessingDrawing" xmlns:wp="http://schemas.openxmlformats.org/drawingml/2006/wordprocessingDrawing" xmlns:w10="urn:schemas-microsoft-com:office:word" xmlns:w="http://schemas.openxmlformats.org/wordprocessingml/2006/main" xmlns:w14="http://schemas.microsoft.com/office/word/2010/wordml" xmlns:w15="http://schemas.microsoft.com/office/word/2012/wordml" xmlns:w16cex="http://schemas.microsoft.com/office/word/2018/wordml/cex" xmlns:w16cid="http://schemas.microsoft.com/office/word/2016/wordml/cid" xmlns:w16="http://schemas.microsoft.com/office/word/2018/wordml" xmlns:w16du="http://schemas.microsoft.com/office/word/2023/wordml/word16du" xmlns:w16sdtdh="http://schemas.microsoft.com/office/word/2020/wordml/sdtdatahash" xmlns:w16sdtfl="http://schemas.microsoft.com/office/word/2024/wordml/sdtformatlock" xmlns:w16se="http://schemas.microsoft.com/office/word/2015/wordml/symex" xmlns:wpg="http://schemas.microsoft.com/office/word/2010/wordprocessingGroup" xmlns:wpi="http://schemas.microsoft.com/office/word/2010/wordprocessingInk" xmlns:wne="http://schemas.microsoft.com/office/word/2006/wordml" xmlns:wps="http://schemas.microsoft.com/office/word/2010/wordprocessingShape" mc:Ignorable="w14 w15 w16se w16cid w16 w16cex w16sdtdh w16sdtfl w16du wp14">
   <w:p>
     <w:pPr>
       <w:pStyle w:val="Header"/>
@@ -3932,8 +4046,8 @@
 </file>
 
 <file path=word/numbering.xml><?xml version="1.0" encoding="utf-8"?>
-<w:numbering xmlns:wpc="http://schemas.microsoft.com/office/word/2010/wordprocessingCanvas" xmlns:mc="http://schemas.openxmlformats.org/markup-compatibility/2006" xmlns:o="urn:schemas-microsoft-com:office:office" xmlns:r="http://schemas.openxmlformats.org/officeDocument/2006/relationships" xmlns:m="http://schemas.openxmlformats.org/officeDocument/2006/math" xmlns:v="urn:schemas-microsoft-com:vml" xmlns:wp14="http://schemas.microsoft.com/office/word/2010/wordprocessingDrawing" xmlns:wp="http://schemas.openxmlformats.org/drawingml/2006/wordprocessingDrawing" xmlns:w10="urn:schemas-microsoft-com:office:word" xmlns:w="http://schemas.openxmlformats.org/wordprocessingml/2006/main" xmlns:w14="http://schemas.microsoft.com/office/word/2010/wordml" xmlns:wpg="http://schemas.microsoft.com/office/word/2010/wordprocessingGroup" xmlns:wpi="http://schemas.microsoft.com/office/word/2010/wordprocessingInk" xmlns:wne="http://schemas.microsoft.com/office/word/2006/wordml" xmlns:wps="http://schemas.microsoft.com/office/word/2010/wordprocessingShape" mc:Ignorable="w14 wp14">
-  <w:abstractNum w:abstractNumId="0">
+<w:numbering xmlns:wpc="http://schemas.microsoft.com/office/word/2010/wordprocessingCanvas" xmlns:cx="http://schemas.microsoft.com/office/drawing/2014/chartex" xmlns:cx1="http://schemas.microsoft.com/office/drawing/2015/9/8/chartex" xmlns:cx2="http://schemas.microsoft.com/office/drawing/2015/10/21/chartex" xmlns:cx3="http://schemas.microsoft.com/office/drawing/2016/5/9/chartex" xmlns:cx4="http://schemas.microsoft.com/office/drawing/2016/5/10/chartex" xmlns:cx5="http://schemas.microsoft.com/office/drawing/2016/5/11/chartex" xmlns:cx6="http://schemas.microsoft.com/office/drawing/2016/5/12/chartex" xmlns:cx7="http://schemas.microsoft.com/office/drawing/2016/5/13/chartex" xmlns:cx8="http://schemas.microsoft.com/office/drawing/2016/5/14/chartex" xmlns:mc="http://schemas.openxmlformats.org/markup-compatibility/2006" xmlns:aink="http://schemas.microsoft.com/office/drawing/2016/ink" xmlns:am3d="http://schemas.microsoft.com/office/drawing/2017/model3d" xmlns:o="urn:schemas-microsoft-com:office:office" xmlns:oel="http://schemas.microsoft.com/office/2019/extlst" xmlns:r="http://schemas.openxmlformats.org/officeDocument/2006/relationships" xmlns:m="http://schemas.openxmlformats.org/officeDocument/2006/math" xmlns:v="urn:schemas-microsoft-com:vml" xmlns:wp14="http://schemas.microsoft.com/office/word/2010/wordprocessingDrawing" xmlns:wp="http://schemas.openxmlformats.org/drawingml/2006/wordprocessingDrawing" xmlns:w10="urn:schemas-microsoft-com:office:word" xmlns:w="http://schemas.openxmlformats.org/wordprocessingml/2006/main" xmlns:w14="http://schemas.microsoft.com/office/word/2010/wordml" xmlns:w15="http://schemas.microsoft.com/office/word/2012/wordml" xmlns:w16cex="http://schemas.microsoft.com/office/word/2018/wordml/cex" xmlns:w16cid="http://schemas.microsoft.com/office/word/2016/wordml/cid" xmlns:w16="http://schemas.microsoft.com/office/word/2018/wordml" xmlns:w16du="http://schemas.microsoft.com/office/word/2023/wordml/word16du" xmlns:w16sdtdh="http://schemas.microsoft.com/office/word/2020/wordml/sdtdatahash" xmlns:w16sdtfl="http://schemas.microsoft.com/office/word/2024/wordml/sdtformatlock" xmlns:w16se="http://schemas.microsoft.com/office/word/2015/wordml/symex" xmlns:wpg="http://schemas.microsoft.com/office/word/2010/wordprocessingGroup" xmlns:wpi="http://schemas.microsoft.com/office/word/2010/wordprocessingInk" xmlns:wne="http://schemas.microsoft.com/office/word/2006/wordml" xmlns:wps="http://schemas.microsoft.com/office/word/2010/wordprocessingShape" mc:Ignorable="w14 w15 w16se w16cid w16 w16cex w16sdtdh w16sdtfl w16du wp14">
+  <w:abstractNum w:abstractNumId="0" w15:restartNumberingAfterBreak="0">
     <w:nsid w:val="04C700C3"/>
     <w:multiLevelType w:val="multilevel"/>
     <w:tmpl w:val="C57CB38C"/>
@@ -4082,7 +4196,7 @@
       </w:rPr>
     </w:lvl>
   </w:abstractNum>
-  <w:abstractNum w:abstractNumId="1">
+  <w:abstractNum w:abstractNumId="1" w15:restartNumberingAfterBreak="0">
     <w:nsid w:val="04E15FE1"/>
     <w:multiLevelType w:val="multilevel"/>
     <w:tmpl w:val="1A0EE288"/>
@@ -4231,7 +4345,7 @@
       </w:rPr>
     </w:lvl>
   </w:abstractNum>
-  <w:abstractNum w:abstractNumId="2">
+  <w:abstractNum w:abstractNumId="2" w15:restartNumberingAfterBreak="0">
     <w:nsid w:val="0E6F722B"/>
     <w:multiLevelType w:val="multilevel"/>
     <w:tmpl w:val="553A0214"/>
@@ -4380,7 +4494,7 @@
       </w:rPr>
     </w:lvl>
   </w:abstractNum>
-  <w:abstractNum w:abstractNumId="3">
+  <w:abstractNum w:abstractNumId="3" w15:restartNumberingAfterBreak="0">
     <w:nsid w:val="0F752CBD"/>
     <w:multiLevelType w:val="multilevel"/>
     <w:tmpl w:val="15A6ECC4"/>
@@ -4529,7 +4643,7 @@
       </w:rPr>
     </w:lvl>
   </w:abstractNum>
-  <w:abstractNum w:abstractNumId="4">
+  <w:abstractNum w:abstractNumId="4" w15:restartNumberingAfterBreak="0">
     <w:nsid w:val="14262276"/>
     <w:multiLevelType w:val="multilevel"/>
     <w:tmpl w:val="A922F5AA"/>
@@ -4678,7 +4792,7 @@
       </w:rPr>
     </w:lvl>
   </w:abstractNum>
-  <w:abstractNum w:abstractNumId="5">
+  <w:abstractNum w:abstractNumId="5" w15:restartNumberingAfterBreak="0">
     <w:nsid w:val="16394C99"/>
     <w:multiLevelType w:val="multilevel"/>
     <w:tmpl w:val="79E02510"/>
@@ -4827,7 +4941,7 @@
       </w:rPr>
     </w:lvl>
   </w:abstractNum>
-  <w:abstractNum w:abstractNumId="6">
+  <w:abstractNum w:abstractNumId="6" w15:restartNumberingAfterBreak="0">
     <w:nsid w:val="175F532C"/>
     <w:multiLevelType w:val="multilevel"/>
     <w:tmpl w:val="0F046F48"/>
@@ -4976,7 +5090,7 @@
       </w:rPr>
     </w:lvl>
   </w:abstractNum>
-  <w:abstractNum w:abstractNumId="7">
+  <w:abstractNum w:abstractNumId="7" w15:restartNumberingAfterBreak="0">
     <w:nsid w:val="1A475C5A"/>
     <w:multiLevelType w:val="multilevel"/>
     <w:tmpl w:val="61AC8256"/>
@@ -5125,7 +5239,7 @@
       </w:rPr>
     </w:lvl>
   </w:abstractNum>
-  <w:abstractNum w:abstractNumId="8">
+  <w:abstractNum w:abstractNumId="8" w15:restartNumberingAfterBreak="0">
     <w:nsid w:val="292E7A25"/>
     <w:multiLevelType w:val="multilevel"/>
     <w:tmpl w:val="5770BD0E"/>
@@ -5274,7 +5388,7 @@
       </w:rPr>
     </w:lvl>
   </w:abstractNum>
-  <w:abstractNum w:abstractNumId="9">
+  <w:abstractNum w:abstractNumId="9" w15:restartNumberingAfterBreak="0">
     <w:nsid w:val="2E7D26ED"/>
     <w:multiLevelType w:val="multilevel"/>
     <w:tmpl w:val="0606717A"/>
@@ -5423,7 +5537,7 @@
       </w:rPr>
     </w:lvl>
   </w:abstractNum>
-  <w:abstractNum w:abstractNumId="10">
+  <w:abstractNum w:abstractNumId="10" w15:restartNumberingAfterBreak="0">
     <w:nsid w:val="342D5DD7"/>
     <w:multiLevelType w:val="multilevel"/>
     <w:tmpl w:val="B1FEF212"/>
@@ -5572,7 +5686,7 @@
       </w:rPr>
     </w:lvl>
   </w:abstractNum>
-  <w:abstractNum w:abstractNumId="11">
+  <w:abstractNum w:abstractNumId="11" w15:restartNumberingAfterBreak="0">
     <w:nsid w:val="41400264"/>
     <w:multiLevelType w:val="multilevel"/>
     <w:tmpl w:val="CD12DDC6"/>
@@ -5721,7 +5835,7 @@
       </w:rPr>
     </w:lvl>
   </w:abstractNum>
-  <w:abstractNum w:abstractNumId="12">
+  <w:abstractNum w:abstractNumId="12" w15:restartNumberingAfterBreak="0">
     <w:nsid w:val="43B37C6E"/>
     <w:multiLevelType w:val="multilevel"/>
     <w:tmpl w:val="ADC28EF0"/>
@@ -5870,7 +5984,7 @@
       </w:rPr>
     </w:lvl>
   </w:abstractNum>
-  <w:abstractNum w:abstractNumId="13">
+  <w:abstractNum w:abstractNumId="13" w15:restartNumberingAfterBreak="0">
     <w:nsid w:val="46893B22"/>
     <w:multiLevelType w:val="multilevel"/>
     <w:tmpl w:val="857E932C"/>
@@ -6019,7 +6133,7 @@
       </w:rPr>
     </w:lvl>
   </w:abstractNum>
-  <w:abstractNum w:abstractNumId="14">
+  <w:abstractNum w:abstractNumId="14" w15:restartNumberingAfterBreak="0">
     <w:nsid w:val="48565148"/>
     <w:multiLevelType w:val="multilevel"/>
     <w:tmpl w:val="DF1A8EDE"/>
@@ -6168,7 +6282,7 @@
       </w:rPr>
     </w:lvl>
   </w:abstractNum>
-  <w:abstractNum w:abstractNumId="15">
+  <w:abstractNum w:abstractNumId="15" w15:restartNumberingAfterBreak="0">
     <w:nsid w:val="48BB7DD3"/>
     <w:multiLevelType w:val="multilevel"/>
     <w:tmpl w:val="C33EA3D6"/>
@@ -6317,7 +6431,119 @@
       </w:rPr>
     </w:lvl>
   </w:abstractNum>
-  <w:abstractNum w:abstractNumId="16">
+  <w:abstractNum w:abstractNumId="16" w15:restartNumberingAfterBreak="0">
+    <w:nsid w:val="4D9D53CB"/>
+    <w:multiLevelType w:val="hybridMultilevel"/>
+    <w:tmpl w:val="6B003D9C"/>
+    <w:lvl w:ilvl="0" w:tplc="B1F0CBE4">
+      <w:numFmt w:val="bullet"/>
+      <w:lvlText w:val="-"/>
+      <w:lvlJc w:val="left"/>
+      <w:pPr>
+        <w:ind w:left="720" w:hanging="360"/>
+      </w:pPr>
+      <w:rPr>
+        <w:rFonts w:ascii="Calibri" w:eastAsiaTheme="minorHAnsi" w:hAnsi="Calibri" w:cs="Calibri" w:hint="default"/>
+      </w:rPr>
+    </w:lvl>
+    <w:lvl w:ilvl="1" w:tplc="10090003" w:tentative="1">
+      <w:start w:val="1"/>
+      <w:numFmt w:val="bullet"/>
+      <w:lvlText w:val="o"/>
+      <w:lvlJc w:val="left"/>
+      <w:pPr>
+        <w:ind w:left="1440" w:hanging="360"/>
+      </w:pPr>
+      <w:rPr>
+        <w:rFonts w:ascii="Courier New" w:hAnsi="Courier New" w:cs="Courier New" w:hint="default"/>
+      </w:rPr>
+    </w:lvl>
+    <w:lvl w:ilvl="2" w:tplc="10090005" w:tentative="1">
+      <w:start w:val="1"/>
+      <w:numFmt w:val="bullet"/>
+      <w:lvlText w:val=""/>
+      <w:lvlJc w:val="left"/>
+      <w:pPr>
+        <w:ind w:left="2160" w:hanging="360"/>
+      </w:pPr>
+      <w:rPr>
+        <w:rFonts w:ascii="Wingdings" w:hAnsi="Wingdings" w:hint="default"/>
+      </w:rPr>
+    </w:lvl>
+    <w:lvl w:ilvl="3" w:tplc="10090001" w:tentative="1">
+      <w:start w:val="1"/>
+      <w:numFmt w:val="bullet"/>
+      <w:lvlText w:val=""/>
+      <w:lvlJc w:val="left"/>
+      <w:pPr>
+        <w:ind w:left="2880" w:hanging="360"/>
+      </w:pPr>
+      <w:rPr>
+        <w:rFonts w:ascii="Symbol" w:hAnsi="Symbol" w:hint="default"/>
+      </w:rPr>
+    </w:lvl>
+    <w:lvl w:ilvl="4" w:tplc="10090003" w:tentative="1">
+      <w:start w:val="1"/>
+      <w:numFmt w:val="bullet"/>
+      <w:lvlText w:val="o"/>
+      <w:lvlJc w:val="left"/>
+      <w:pPr>
+        <w:ind w:left="3600" w:hanging="360"/>
+      </w:pPr>
+      <w:rPr>
+        <w:rFonts w:ascii="Courier New" w:hAnsi="Courier New" w:cs="Courier New" w:hint="default"/>
+      </w:rPr>
+    </w:lvl>
+    <w:lvl w:ilvl="5" w:tplc="10090005" w:tentative="1">
+      <w:start w:val="1"/>
+      <w:numFmt w:val="bullet"/>
+      <w:lvlText w:val=""/>
+      <w:lvlJc w:val="left"/>
+      <w:pPr>
+        <w:ind w:left="4320" w:hanging="360"/>
+      </w:pPr>
+      <w:rPr>
+        <w:rFonts w:ascii="Wingdings" w:hAnsi="Wingdings" w:hint="default"/>
+      </w:rPr>
+    </w:lvl>
+    <w:lvl w:ilvl="6" w:tplc="10090001" w:tentative="1">
+      <w:start w:val="1"/>
+      <w:numFmt w:val="bullet"/>
+      <w:lvlText w:val=""/>
+      <w:lvlJc w:val="left"/>
+      <w:pPr>
+        <w:ind w:left="5040" w:hanging="360"/>
+      </w:pPr>
+      <w:rPr>
+        <w:rFonts w:ascii="Symbol" w:hAnsi="Symbol" w:hint="default"/>
+      </w:rPr>
+    </w:lvl>
+    <w:lvl w:ilvl="7" w:tplc="10090003" w:tentative="1">
+      <w:start w:val="1"/>
+      <w:numFmt w:val="bullet"/>
+      <w:lvlText w:val="o"/>
+      <w:lvlJc w:val="left"/>
+      <w:pPr>
+        <w:ind w:left="5760" w:hanging="360"/>
+      </w:pPr>
+      <w:rPr>
+        <w:rFonts w:ascii="Courier New" w:hAnsi="Courier New" w:cs="Courier New" w:hint="default"/>
+      </w:rPr>
+    </w:lvl>
+    <w:lvl w:ilvl="8" w:tplc="10090005" w:tentative="1">
+      <w:start w:val="1"/>
+      <w:numFmt w:val="bullet"/>
+      <w:lvlText w:val=""/>
+      <w:lvlJc w:val="left"/>
+      <w:pPr>
+        <w:ind w:left="6480" w:hanging="360"/>
+      </w:pPr>
+      <w:rPr>
+        <w:rFonts w:ascii="Wingdings" w:hAnsi="Wingdings" w:hint="default"/>
+      </w:rPr>
+    </w:lvl>
+  </w:abstractNum>
+  <w:abstractNum w:abstractNumId="17" w15:restartNumberingAfterBreak="0">
     <w:nsid w:val="5C282F59"/>
     <w:multiLevelType w:val="multilevel"/>
     <w:tmpl w:val="30C681AA"/>
@@ -6466,7 +6692,7 @@
       </w:rPr>
     </w:lvl>
   </w:abstractNum>
-  <w:abstractNum w:abstractNumId="17">
+  <w:abstractNum w:abstractNumId="18" w15:restartNumberingAfterBreak="0">
     <w:nsid w:val="5DB2334A"/>
     <w:multiLevelType w:val="multilevel"/>
     <w:tmpl w:val="9C4ECBDC"/>
@@ -6615,7 +6841,7 @@
       </w:rPr>
     </w:lvl>
   </w:abstractNum>
-  <w:abstractNum w:abstractNumId="18">
+  <w:abstractNum w:abstractNumId="19" w15:restartNumberingAfterBreak="0">
     <w:nsid w:val="660F26CF"/>
     <w:multiLevelType w:val="hybridMultilevel"/>
     <w:tmpl w:val="23084290"/>
@@ -6728,7 +6954,7 @@
       </w:rPr>
     </w:lvl>
   </w:abstractNum>
-  <w:abstractNum w:abstractNumId="19">
+  <w:abstractNum w:abstractNumId="20" w15:restartNumberingAfterBreak="0">
     <w:nsid w:val="6A744496"/>
     <w:multiLevelType w:val="multilevel"/>
     <w:tmpl w:val="CACEC7AE"/>
@@ -6877,7 +7103,7 @@
       </w:rPr>
     </w:lvl>
   </w:abstractNum>
-  <w:abstractNum w:abstractNumId="20">
+  <w:abstractNum w:abstractNumId="21" w15:restartNumberingAfterBreak="0">
     <w:nsid w:val="6AA339BD"/>
     <w:multiLevelType w:val="multilevel"/>
     <w:tmpl w:val="914A3DE2"/>
@@ -7026,7 +7252,7 @@
       </w:rPr>
     </w:lvl>
   </w:abstractNum>
-  <w:abstractNum w:abstractNumId="21">
+  <w:abstractNum w:abstractNumId="22" w15:restartNumberingAfterBreak="0">
     <w:nsid w:val="72003E8A"/>
     <w:multiLevelType w:val="multilevel"/>
     <w:tmpl w:val="DB5609A8"/>
@@ -7175,7 +7401,7 @@
       </w:rPr>
     </w:lvl>
   </w:abstractNum>
-  <w:abstractNum w:abstractNumId="22">
+  <w:abstractNum w:abstractNumId="23" w15:restartNumberingAfterBreak="0">
     <w:nsid w:val="7EC77BD6"/>
     <w:multiLevelType w:val="multilevel"/>
     <w:tmpl w:val="337C8FE4"/>
@@ -7324,92 +7550,86 @@
       </w:rPr>
     </w:lvl>
   </w:abstractNum>
-  <w:num w:numId="1">
+  <w:num w:numId="1" w16cid:durableId="509638877">
+    <w:abstractNumId w:val="19"/>
+  </w:num>
+  <w:num w:numId="2" w16cid:durableId="1302344917">
+    <w:abstractNumId w:val="4"/>
+  </w:num>
+  <w:num w:numId="3" w16cid:durableId="650910864">
+    <w:abstractNumId w:val="15"/>
+  </w:num>
+  <w:num w:numId="4" w16cid:durableId="1456094411">
+    <w:abstractNumId w:val="20"/>
+  </w:num>
+  <w:num w:numId="5" w16cid:durableId="405810620">
+    <w:abstractNumId w:val="11"/>
+  </w:num>
+  <w:num w:numId="6" w16cid:durableId="1207134872">
+    <w:abstractNumId w:val="9"/>
+  </w:num>
+  <w:num w:numId="7" w16cid:durableId="1323503433">
+    <w:abstractNumId w:val="1"/>
+  </w:num>
+  <w:num w:numId="8" w16cid:durableId="876507771">
+    <w:abstractNumId w:val="13"/>
+  </w:num>
+  <w:num w:numId="9" w16cid:durableId="1487235220">
+    <w:abstractNumId w:val="3"/>
+  </w:num>
+  <w:num w:numId="10" w16cid:durableId="1161851744">
+    <w:abstractNumId w:val="14"/>
+  </w:num>
+  <w:num w:numId="11" w16cid:durableId="244580970">
+    <w:abstractNumId w:val="0"/>
+  </w:num>
+  <w:num w:numId="12" w16cid:durableId="742527192">
+    <w:abstractNumId w:val="23"/>
+  </w:num>
+  <w:num w:numId="13" w16cid:durableId="1618029851">
+    <w:abstractNumId w:val="7"/>
+  </w:num>
+  <w:num w:numId="14" w16cid:durableId="1649551073">
+    <w:abstractNumId w:val="10"/>
+  </w:num>
+  <w:num w:numId="15" w16cid:durableId="1018696215">
+    <w:abstractNumId w:val="21"/>
+  </w:num>
+  <w:num w:numId="16" w16cid:durableId="1182620082">
+    <w:abstractNumId w:val="17"/>
+  </w:num>
+  <w:num w:numId="17" w16cid:durableId="1889686404">
+    <w:abstractNumId w:val="2"/>
+  </w:num>
+  <w:num w:numId="18" w16cid:durableId="1074084043">
+    <w:abstractNumId w:val="8"/>
+  </w:num>
+  <w:num w:numId="19" w16cid:durableId="95372512">
+    <w:abstractNumId w:val="12"/>
+  </w:num>
+  <w:num w:numId="20" w16cid:durableId="1613242799">
+    <w:abstractNumId w:val="22"/>
+  </w:num>
+  <w:num w:numId="21" w16cid:durableId="1465730573">
+    <w:abstractNumId w:val="6"/>
+  </w:num>
+  <w:num w:numId="22" w16cid:durableId="1443378820">
     <w:abstractNumId w:val="18"/>
   </w:num>
-  <w:num w:numId="2">
-    <w:abstractNumId w:val="4"/>
+  <w:num w:numId="23" w16cid:durableId="904031537">
+    <w:abstractNumId w:val="5"/>
   </w:num>
-  <w:num w:numId="3">
-    <w:abstractNumId w:val="15"/>
-  </w:num>
-  <w:num w:numId="4">
+  <w:num w:numId="24" w16cid:durableId="1457333367">
     <w:abstractNumId w:val="19"/>
   </w:num>
-  <w:num w:numId="5">
-    <w:abstractNumId w:val="11"/>
-  </w:num>
-  <w:num w:numId="6">
-    <w:abstractNumId w:val="9"/>
-  </w:num>
-  <w:num w:numId="7">
-    <w:abstractNumId w:val="1"/>
-  </w:num>
-  <w:num w:numId="8">
-    <w:abstractNumId w:val="13"/>
-  </w:num>
-  <w:num w:numId="9">
-    <w:abstractNumId w:val="3"/>
-  </w:num>
-  <w:num w:numId="10">
-    <w:abstractNumId w:val="14"/>
-  </w:num>
-  <w:num w:numId="11">
-    <w:abstractNumId w:val="0"/>
-  </w:num>
-  <w:num w:numId="12">
-    <w:abstractNumId w:val="22"/>
-  </w:num>
-  <w:num w:numId="13">
-    <w:abstractNumId w:val="7"/>
-  </w:num>
-  <w:num w:numId="14">
-    <w:abstractNumId w:val="10"/>
-  </w:num>
-  <w:num w:numId="15">
-    <w:abstractNumId w:val="20"/>
-  </w:num>
-  <w:num w:numId="16">
+  <w:num w:numId="25" w16cid:durableId="2031759952">
     <w:abstractNumId w:val="16"/>
-  </w:num>
-  <w:num w:numId="17">
-    <w:abstractNumId w:val="2"/>
-  </w:num>
-  <w:num w:numId="18">
-    <w:abstractNumId w:val="8"/>
-  </w:num>
-  <w:num w:numId="19">
-    <w:abstractNumId w:val="12"/>
-  </w:num>
-  <w:num w:numId="20">
-    <w:abstractNumId w:val="21"/>
-  </w:num>
-  <w:num w:numId="21">
-    <w:abstractNumId w:val="6"/>
-  </w:num>
-  <w:num w:numId="22">
-    <w:abstractNumId w:val="17"/>
-  </w:num>
-  <w:num w:numId="23">
-    <w:abstractNumId w:val="5"/>
-  </w:num>
-  <w:num w:numId="24">
-    <w:abstractNumId w:val="18"/>
-    <w:lvlOverride w:ilvl="0"/>
-    <w:lvlOverride w:ilvl="1"/>
-    <w:lvlOverride w:ilvl="2"/>
-    <w:lvlOverride w:ilvl="3"/>
-    <w:lvlOverride w:ilvl="4"/>
-    <w:lvlOverride w:ilvl="5"/>
-    <w:lvlOverride w:ilvl="6"/>
-    <w:lvlOverride w:ilvl="7"/>
-    <w:lvlOverride w:ilvl="8"/>
   </w:num>
 </w:numbering>
 </file>
 
 <file path=word/styles.xml><?xml version="1.0" encoding="utf-8"?>
-<w:styles xmlns:mc="http://schemas.openxmlformats.org/markup-compatibility/2006" xmlns:r="http://schemas.openxmlformats.org/officeDocument/2006/relationships" xmlns:w="http://schemas.openxmlformats.org/wordprocessingml/2006/main" xmlns:w14="http://schemas.microsoft.com/office/word/2010/wordml" mc:Ignorable="w14">
+<w:styles xmlns:mc="http://schemas.openxmlformats.org/markup-compatibility/2006" xmlns:r="http://schemas.openxmlformats.org/officeDocument/2006/relationships" xmlns:w="http://schemas.openxmlformats.org/wordprocessingml/2006/main" xmlns:w14="http://schemas.microsoft.com/office/word/2010/wordml" xmlns:w15="http://schemas.microsoft.com/office/word/2012/wordml" xmlns:w16cex="http://schemas.microsoft.com/office/word/2018/wordml/cex" xmlns:w16cid="http://schemas.microsoft.com/office/word/2016/wordml/cid" xmlns:w16="http://schemas.microsoft.com/office/word/2018/wordml" xmlns:w16du="http://schemas.microsoft.com/office/word/2023/wordml/word16du" xmlns:w16sdtdh="http://schemas.microsoft.com/office/word/2020/wordml/sdtdatahash" xmlns:w16sdtfl="http://schemas.microsoft.com/office/word/2024/wordml/sdtformatlock" xmlns:w16se="http://schemas.microsoft.com/office/word/2015/wordml/symex" mc:Ignorable="w14 w15 w16se w16cid w16 w16cex w16sdtdh w16sdtfl w16du">
   <w:docDefaults>
     <w:rPrDefault>
       <w:rPr>
@@ -7427,486 +7647,383 @@
       </w:pPr>
     </w:pPrDefault>
   </w:docDefaults>
-  <w:latentStyles w:defLockedState="0" w:defUIPriority="99" w:defSemiHidden="1" w:defUnhideWhenUsed="1" w:defQFormat="0" w:count="267">
-    <w:lsdException w:name="Normal" w:semiHidden="0" w:uiPriority="0" w:unhideWhenUsed="0" w:qFormat="1"/>
-    <w:lsdException w:name="heading 1" w:semiHidden="0" w:uiPriority="9" w:unhideWhenUsed="0" w:qFormat="1"/>
-    <w:lsdException w:name="heading 2" w:uiPriority="9" w:qFormat="1"/>
-    <w:lsdException w:name="heading 3" w:uiPriority="9" w:qFormat="1"/>
-    <w:lsdException w:name="heading 4" w:uiPriority="9" w:qFormat="1"/>
-    <w:lsdException w:name="heading 5" w:uiPriority="9" w:qFormat="1"/>
-    <w:lsdException w:name="heading 6" w:uiPriority="9" w:qFormat="1"/>
-    <w:lsdException w:name="heading 7" w:uiPriority="9" w:qFormat="1"/>
-    <w:lsdException w:name="heading 8" w:uiPriority="9" w:qFormat="1"/>
-    <w:lsdException w:name="heading 9" w:uiPriority="9" w:qFormat="1"/>
-    <w:lsdException w:name="toc 1" w:uiPriority="39"/>
-    <w:lsdException w:name="toc 2" w:uiPriority="39"/>
-    <w:lsdException w:name="toc 3" w:uiPriority="39"/>
-    <w:lsdException w:name="toc 4" w:uiPriority="39"/>
-    <w:lsdException w:name="toc 5" w:uiPriority="39"/>
-    <w:lsdException w:name="toc 6" w:uiPriority="39"/>
-    <w:lsdException w:name="toc 7" w:uiPriority="39"/>
-    <w:lsdException w:name="toc 8" w:uiPriority="39"/>
-    <w:lsdException w:name="toc 9" w:uiPriority="39"/>
-    <w:lsdException w:name="caption" w:uiPriority="35" w:qFormat="1"/>
-    <w:lsdException w:name="Title" w:semiHidden="0" w:uiPriority="10" w:unhideWhenUsed="0" w:qFormat="1"/>
-    <w:lsdException w:name="Default Paragraph Font" w:uiPriority="1"/>
-    <w:lsdException w:name="Subtitle" w:semiHidden="0" w:uiPriority="11" w:unhideWhenUsed="0" w:qFormat="1"/>
-    <w:lsdException w:name="Strong" w:semiHidden="0" w:uiPriority="22" w:unhideWhenUsed="0" w:qFormat="1"/>
-    <w:lsdException w:name="Emphasis" w:semiHidden="0" w:uiPriority="20" w:unhideWhenUsed="0" w:qFormat="1"/>
-    <w:lsdException w:name="Table Grid" w:semiHidden="0" w:uiPriority="59" w:unhideWhenUsed="0"/>
-    <w:lsdException w:name="Placeholder Text" w:unhideWhenUsed="0"/>
-    <w:lsdException w:name="No Spacing" w:semiHidden="0" w:uiPriority="1" w:unhideWhenUsed="0" w:qFormat="1"/>
-    <w:lsdException w:name="Light Shading" w:semiHidden="0" w:uiPriority="60" w:unhideWhenUsed="0"/>
-    <w:lsdException w:name="Light List" w:semiHidden="0" w:uiPriority="61" w:unhideWhenUsed="0"/>
-    <w:lsdException w:name="Light Grid" w:semiHidden="0" w:uiPriority="62" w:unhideWhenUsed="0"/>
-    <w:lsdException w:name="Medium Shading 1" w:semiHidden="0" w:uiPriority="63" w:unhideWhenUsed="0"/>
-    <w:lsdException w:name="Medium Shading 2" w:semiHidden="0" w:uiPriority="64" w:unhideWhenUsed="0"/>
-    <w:lsdException w:name="Medium List 1" w:semiHidden="0" w:uiPriority="65" w:unhideWhenUsed="0"/>
-    <w:lsdException w:name="Medium List 2" w:semiHidden="0" w:uiPriority="66" w:unhideWhenUsed="0"/>
-    <w:lsdException w:name="Medium Grid 1" w:semiHidden="0" w:uiPriority="67" w:unhideWhenUsed="0"/>
-    <w:lsdException w:name="Medium Grid 2" w:semiHidden="0" w:uiPriority="68" w:unhideWhenUsed="0"/>
-    <w:lsdException w:name="Medium Grid 3" w:semiHidden="0" w:uiPriority="69" w:unhideWhenUsed="0"/>
-    <w:lsdException w:name="Dark List" w:semiHidden="0" w:uiPriority="70" w:unhideWhenUsed="0"/>
-    <w:lsdException w:name="Colorful Shading" w:semiHidden="0" w:uiPriority="71" w:unhideWhenUsed="0"/>
-    <w:lsdException w:name="Colorful List" w:semiHidden="0" w:uiPriority="72" w:unhideWhenUsed="0"/>
-    <w:lsdException w:name="Colorful Grid" w:semiHidden="0" w:uiPriority="73" w:unhideWhenUsed="0"/>
-    <w:lsdException w:name="Light Shading Accent 1" w:semiHidden="0" w:uiPriority="60" w:unhideWhenUsed="0"/>
-    <w:lsdException w:name="Light List Accent 1" w:semiHidden="0" w:uiPriority="61" w:unhideWhenUsed="0"/>
-    <w:lsdException w:name="Light Grid Accent 1" w:semiHidden="0" w:uiPriority="62" w:unhideWhenUsed="0"/>
-    <w:lsdException w:name="Medium Shading 1 Accent 1" w:semiHidden="0" w:uiPriority="63" w:unhideWhenUsed="0"/>
-    <w:lsdException w:name="Medium Shading 2 Accent 1" w:semiHidden="0" w:uiPriority="64" w:unhideWhenUsed="0"/>
-    <w:lsdException w:name="Medium List 1 Accent 1" w:semiHidden="0" w:uiPriority="65" w:unhideWhenUsed="0"/>
-    <w:lsdException w:name="Revision" w:unhideWhenUsed="0"/>
-    <w:lsdException w:name="List Paragraph" w:semiHidden="0" w:uiPriority="34" w:unhideWhenUsed="0" w:qFormat="1"/>
-    <w:lsdException w:name="Quote" w:semiHidden="0" w:uiPriority="29" w:unhideWhenUsed="0" w:qFormat="1"/>
-    <w:lsdException w:name="Intense Quote" w:semiHidden="0" w:uiPriority="30" w:unhideWhenUsed="0" w:qFormat="1"/>
-    <w:lsdException w:name="Medium List 2 Accent 1" w:semiHidden="0" w:uiPriority="66" w:unhideWhenUsed="0"/>
-    <w:lsdException w:name="Medium Grid 1 Accent 1" w:semiHidden="0" w:uiPriority="67" w:unhideWhenUsed="0"/>
-    <w:lsdException w:name="Medium Grid 2 Accent 1" w:semiHidden="0" w:uiPriority="68" w:unhideWhenUsed="0"/>
-    <w:lsdException w:name="Medium Grid 3 Accent 1" w:semiHidden="0" w:uiPriority="69" w:unhideWhenUsed="0"/>
-    <w:lsdException w:name="Dark List Accent 1" w:semiHidden="0" w:uiPriority="70" w:unhideWhenUsed="0"/>
-    <w:lsdException w:name="Colorful Shading Accent 1" w:semiHidden="0" w:uiPriority="71" w:unhideWhenUsed="0"/>
-    <w:lsdException w:name="Colorful List Accent 1" w:semiHidden="0" w:uiPriority="72" w:unhideWhenUsed="0"/>
-    <w:lsdException w:name="Colorful Grid Accent 1" w:semiHidden="0" w:uiPriority="73" w:unhideWhenUsed="0"/>
-    <w:lsdException w:name="Light Shading Accent 2" w:semiHidden="0" w:uiPriority="60" w:unhideWhenUsed="0"/>
-    <w:lsdException w:name="Light List Accent 2" w:semiHidden="0" w:uiPriority="61" w:unhideWhenUsed="0"/>
-    <w:lsdException w:name="Light Grid Accent 2" w:semiHidden="0" w:uiPriority="62" w:unhideWhenUsed="0"/>
-    <w:lsdException w:name="Medium Shading 1 Accent 2" w:semiHidden="0" w:uiPriority="63" w:unhideWhenUsed="0"/>
-    <w:lsdException w:name="Medium Shading 2 Accent 2" w:semiHidden="0" w:uiPriority="64" w:unhideWhenUsed="0"/>
-    <w:lsdException w:name="Medium List 1 Accent 2" w:semiHidden="0" w:uiPriority="65" w:unhideWhenUsed="0"/>
-    <w:lsdException w:name="Medium List 2 Accent 2" w:semiHidden="0" w:uiPriority="66" w:unhideWhenUsed="0"/>
-    <w:lsdException w:name="Medium Grid 1 Accent 2" w:semiHidden="0" w:uiPriority="67" w:unhideWhenUsed="0"/>
-    <w:lsdException w:name="Medium Grid 2 Accent 2" w:semiHidden="0" w:uiPriority="68" w:unhideWhenUsed="0"/>
-    <w:lsdException w:name="Medium Grid 3 Accent 2" w:semiHidden="0" w:uiPriority="69" w:unhideWhenUsed="0"/>
-    <w:lsdException w:name="Dark List Accent 2" w:semiHidden="0" w:uiPriority="70" w:unhideWhenUsed="0"/>
-    <w:lsdException w:name="Colorful Shading Accent 2" w:semiHidden="0" w:uiPriority="71" w:unhideWhenUsed="0"/>
-    <w:lsdException w:name="Colorful List Accent 2" w:semiHidden="0" w:uiPriority="72" w:unhideWhenUsed="0"/>
-    <w:lsdException w:name="Colorful Grid Accent 2" w:semiHidden="0" w:uiPriority="73" w:unhideWhenUsed="0"/>
-    <w:lsdException w:name="Light Shading Accent 3" w:semiHidden="0" w:uiPriority="60" w:unhideWhenUsed="0"/>
-    <w:lsdException w:name="Light List Accent 3" w:semiHidden="0" w:uiPriority="61" w:unhideWhenUsed="0"/>
-    <w:lsdException w:name="Light Grid Accent 3" w:semiHidden="0" w:uiPriority="62" w:unhideWhenUsed="0"/>
-    <w:lsdException w:name="Medium Shading 1 Accent 3" w:semiHidden="0" w:uiPriority="63" w:unhideWhenUsed="0"/>
-    <w:lsdException w:name="Medium Shading 2 Accent 3" w:semiHidden="0" w:uiPriority="64" w:unhideWhenUsed="0"/>
-    <w:lsdException w:name="Medium List 1 Accent 3" w:semiHidden="0" w:uiPriority="65" w:unhideWhenUsed="0"/>
-    <w:lsdException w:name="Medium List 2 Accent 3" w:semiHidden="0" w:uiPriority="66" w:unhideWhenUsed="0"/>
-    <w:lsdException w:name="Medium Grid 1 Accent 3" w:semiHidden="0" w:uiPriority="67" w:unhideWhenUsed="0"/>
-    <w:lsdException w:name="Medium Grid 2 Accent 3" w:semiHidden="0" w:uiPriority="68" w:unhideWhenUsed="0"/>
-    <w:lsdException w:name="Medium Grid 3 Accent 3" w:semiHidden="0" w:uiPriority="69" w:unhideWhenUsed="0"/>
-    <w:lsdException w:name="Dark List Accent 3" w:semiHidden="0" w:uiPriority="70" w:unhideWhenUsed="0"/>
-    <w:lsdException w:name="Colorful Shading Accent 3" w:semiHidden="0" w:uiPriority="71" w:unhideWhenUsed="0"/>
-    <w:lsdException w:name="Colorful List Accent 3" w:semiHidden="0" w:uiPriority="72" w:unhideWhenUsed="0"/>
-    <w:lsdException w:name="Colorful Grid Accent 3" w:semiHidden="0" w:uiPriority="73" w:unhideWhenUsed="0"/>
-    <w:lsdException w:name="Light Shading Accent 4" w:semiHidden="0" w:uiPriority="60" w:unhideWhenUsed="0"/>
-    <w:lsdException w:name="Light List Accent 4" w:semiHidden="0" w:uiPriority="61" w:unhideWhenUsed="0"/>
-    <w:lsdException w:name="Light Grid Accent 4" w:semiHidden="0" w:uiPriority="62" w:unhideWhenUsed="0"/>
-    <w:lsdException w:name="Medium Shading 1 Accent 4" w:semiHidden="0" w:uiPriority="63" w:unhideWhenUsed="0"/>
-    <w:lsdException w:name="Medium Shading 2 Accent 4" w:semiHidden="0" w:uiPriority="64" w:unhideWhenUsed="0"/>
-    <w:lsdException w:name="Medium List 1 Accent 4" w:semiHidden="0" w:uiPriority="65" w:unhideWhenUsed="0"/>
-    <w:lsdException w:name="Medium List 2 Accent 4" w:semiHidden="0" w:uiPriority="66" w:unhideWhenUsed="0"/>
-    <w:lsdException w:name="Medium Grid 1 Accent 4" w:semiHidden="0" w:uiPriority="67" w:unhideWhenUsed="0"/>
-    <w:lsdException w:name="Medium Grid 2 Accent 4" w:semiHidden="0" w:uiPriority="68" w:unhideWhenUsed="0"/>
-    <w:lsdException w:name="Medium Grid 3 Accent 4" w:semiHidden="0" w:uiPriority="69" w:unhideWhenUsed="0"/>
-    <w:lsdException w:name="Dark List Accent 4" w:semiHidden="0" w:uiPriority="70" w:unhideWhenUsed="0"/>
-    <w:lsdException w:name="Colorful Shading Accent 4" w:semiHidden="0" w:uiPriority="71" w:unhideWhenUsed="0"/>
-    <w:lsdException w:name="Colorful List Accent 4" w:semiHidden="0" w:uiPriority="72" w:unhideWhenUsed="0"/>
-    <w:lsdException w:name="Colorful Grid Accent 4" w:semiHidden="0" w:uiPriority="73" w:unhideWhenUsed="0"/>
-    <w:lsdException w:name="Light Shading Accent 5" w:semiHidden="0" w:uiPriority="60" w:unhideWhenUsed="0"/>
-    <w:lsdException w:name="Light List Accent 5" w:semiHidden="0" w:uiPriority="61" w:unhideWhenUsed="0"/>
-    <w:lsdException w:name="Light Grid Accent 5" w:semiHidden="0" w:uiPriority="62" w:unhideWhenUsed="0"/>
-    <w:lsdException w:name="Medium Shading 1 Accent 5" w:semiHidden="0" w:uiPriority="63" w:unhideWhenUsed="0"/>
-    <w:lsdException w:name="Medium Shading 2 Accent 5" w:semiHidden="0" w:uiPriority="64" w:unhideWhenUsed="0"/>
-    <w:lsdException w:name="Medium List 1 Accent 5" w:semiHidden="0" w:uiPriority="65" w:unhideWhenUsed="0"/>
-    <w:lsdException w:name="Medium List 2 Accent 5" w:semiHidden="0" w:uiPriority="66" w:unhideWhenUsed="0"/>
-    <w:lsdException w:name="Medium Grid 1 Accent 5" w:semiHidden="0" w:uiPriority="67" w:unhideWhenUsed="0"/>
-    <w:lsdException w:name="Medium Grid 2 Accent 5" w:semiHidden="0" w:uiPriority="68" w:unhideWhenUsed="0"/>
-    <w:lsdException w:name="Medium Grid 3 Accent 5" w:semiHidden="0" w:uiPriority="69" w:unhideWhenUsed="0"/>
-    <w:lsdException w:name="Dark List Accent 5" w:semiHidden="0" w:uiPriority="70" w:unhideWhenUsed="0"/>
-    <w:lsdException w:name="Colorful Shading Accent 5" w:semiHidden="0" w:uiPriority="71" w:unhideWhenUsed="0"/>
-    <w:lsdException w:name="Colorful List Accent 5" w:semiHidden="0" w:uiPriority="72" w:unhideWhenUsed="0"/>
-    <w:lsdException w:name="Colorful Grid Accent 5" w:semiHidden="0" w:uiPriority="73" w:unhideWhenUsed="0"/>
-    <w:lsdException w:name="Light Shading Accent 6" w:semiHidden="0" w:uiPriority="60" w:unhideWhenUsed="0"/>
-    <w:lsdException w:name="Light List Accent 6" w:semiHidden="0" w:uiPriority="61" w:unhideWhenUsed="0"/>
-    <w:lsdException w:name="Light Grid Accent 6" w:semiHidden="0" w:uiPriority="62" w:unhideWhenUsed="0"/>
-    <w:lsdException w:name="Medium Shading 1 Accent 6" w:semiHidden="0" w:uiPriority="63" w:unhideWhenUsed="0"/>
-    <w:lsdException w:name="Medium Shading 2 Accent 6" w:semiHidden="0" w:uiPriority="64" w:unhideWhenUsed="0"/>
-    <w:lsdException w:name="Medium List 1 Accent 6" w:semiHidden="0" w:uiPriority="65" w:unhideWhenUsed="0"/>
-    <w:lsdException w:name="Medium List 2 Accent 6" w:semiHidden="0" w:uiPriority="66" w:unhideWhenUsed="0"/>
-    <w:lsdException w:name="Medium Grid 1 Accent 6" w:semiHidden="0" w:uiPriority="67" w:unhideWhenUsed="0"/>
-    <w:lsdException w:name="Medium Grid 2 Accent 6" w:semiHidden="0" w:uiPriority="68" w:unhideWhenUsed="0"/>
-    <w:lsdException w:name="Medium Grid 3 Accent 6" w:semiHidden="0" w:uiPriority="69" w:unhideWhenUsed="0"/>
-    <w:lsdException w:name="Dark List Accent 6" w:semiHidden="0" w:uiPriority="70" w:unhideWhenUsed="0"/>
-    <w:lsdException w:name="Colorful Shading Accent 6" w:semiHidden="0" w:uiPriority="71" w:unhideWhenUsed="0"/>
-    <w:lsdException w:name="Colorful List Accent 6" w:semiHidden="0" w:uiPriority="72" w:unhideWhenUsed="0"/>
-    <w:lsdException w:name="Colorful Grid Accent 6" w:semiHidden="0" w:uiPriority="73" w:unhideWhenUsed="0"/>
-    <w:lsdException w:name="Subtle Emphasis" w:semiHidden="0" w:uiPriority="19" w:unhideWhenUsed="0" w:qFormat="1"/>
-    <w:lsdException w:name="Intense Emphasis" w:semiHidden="0" w:uiPriority="21" w:unhideWhenUsed="0" w:qFormat="1"/>
-    <w:lsdException w:name="Subtle Reference" w:semiHidden="0" w:uiPriority="31" w:unhideWhenUsed="0" w:qFormat="1"/>
-    <w:lsdException w:name="Intense Reference" w:semiHidden="0" w:uiPriority="32" w:unhideWhenUsed="0" w:qFormat="1"/>
-    <w:lsdException w:name="Book Title" w:semiHidden="0" w:uiPriority="33" w:unhideWhenUsed="0" w:qFormat="1"/>
-    <w:lsdException w:name="Bibliography" w:uiPriority="37"/>
-    <w:lsdException w:name="TOC Heading" w:uiPriority="39" w:qFormat="1"/>
-  </w:latentStyles>
-  <w:style w:type="paragraph" w:default="1" w:styleId="Normal">
-    <w:name w:val="Normal"/>
-    <w:qFormat/>
-    <w:rsid w:val="00D56090"/>
-    <w:pPr>
-      <w:spacing w:after="200" w:line="276" w:lineRule="auto"/>
-    </w:pPr>
-    <w:rPr>
-      <w:kern w:val="0"/>
-      <w:lang w:val="en-CA"/>
-      <w14:ligatures w14:val="none"/>
-    </w:rPr>
-  </w:style>
-  <w:style w:type="paragraph" w:styleId="Heading1">
-    <w:name w:val="heading 1"/>
-    <w:basedOn w:val="Normal"/>
-    <w:next w:val="Normal"/>
-    <w:link w:val="Heading1Char"/>
-    <w:uiPriority w:val="9"/>
-    <w:qFormat/>
-    <w:rsid w:val="00E63279"/>
-    <w:pPr>
-      <w:keepNext/>
-      <w:keepLines/>
-      <w:spacing w:before="240" w:after="0"/>
-      <w:outlineLvl w:val="0"/>
-    </w:pPr>
-    <w:rPr>
-      <w:rFonts w:asciiTheme="majorHAnsi" w:eastAsiaTheme="majorEastAsia" w:hAnsiTheme="majorHAnsi" w:cstheme="majorBidi"/>
-      <w:color w:val="2F5496" w:themeColor="accent1" w:themeShade="BF"/>
-      <w:sz w:val="32"/>
-      <w:szCs w:val="32"/>
-    </w:rPr>
-  </w:style>
-  <w:style w:type="character" w:default="1" w:styleId="DefaultParagraphFont">
-    <w:name w:val="Default Paragraph Font"/>
-    <w:uiPriority w:val="1"/>
-    <w:semiHidden/>
-    <w:unhideWhenUsed/>
-  </w:style>
-  <w:style w:type="table" w:default="1" w:styleId="TableNormal">
-    <w:name w:val="Normal Table"/>
-    <w:uiPriority w:val="99"/>
-    <w:semiHidden/>
-    <w:unhideWhenUsed/>
-    <w:tblPr>
-      <w:tblInd w:w="0" w:type="dxa"/>
-      <w:tblCellMar>
-        <w:top w:w="0" w:type="dxa"/>
-        <w:left w:w="108" w:type="dxa"/>
-        <w:bottom w:w="0" w:type="dxa"/>
-        <w:right w:w="108" w:type="dxa"/>
-      </w:tblCellMar>
-    </w:tblPr>
-  </w:style>
-  <w:style w:type="numbering" w:default="1" w:styleId="NoList">
-    <w:name w:val="No List"/>
-    <w:uiPriority w:val="99"/>
-    <w:semiHidden/>
-    <w:unhideWhenUsed/>
-  </w:style>
-  <w:style w:type="paragraph" w:styleId="Header">
-    <w:name w:val="header"/>
-    <w:basedOn w:val="Normal"/>
-    <w:link w:val="HeaderChar"/>
-    <w:uiPriority w:val="99"/>
-    <w:unhideWhenUsed/>
-    <w:rsid w:val="00E63279"/>
-    <w:pPr>
-      <w:tabs>
-        <w:tab w:val="center" w:pos="4680"/>
-        <w:tab w:val="right" w:pos="9360"/>
-      </w:tabs>
-      <w:spacing w:after="0" w:line="240" w:lineRule="auto"/>
-    </w:pPr>
-    <w:rPr>
-      <w:kern w:val="2"/>
-      <w:lang w:val="en-US"/>
-      <w14:ligatures w14:val="standardContextual"/>
-    </w:rPr>
-  </w:style>
-  <w:style w:type="character" w:customStyle="1" w:styleId="HeaderChar">
-    <w:name w:val="Header Char"/>
-    <w:basedOn w:val="DefaultParagraphFont"/>
-    <w:link w:val="Header"/>
-    <w:uiPriority w:val="99"/>
-    <w:rsid w:val="00E63279"/>
-  </w:style>
-  <w:style w:type="paragraph" w:styleId="Footer">
-    <w:name w:val="footer"/>
-    <w:basedOn w:val="Normal"/>
-    <w:link w:val="FooterChar"/>
-    <w:uiPriority w:val="99"/>
-    <w:unhideWhenUsed/>
-    <w:rsid w:val="00E63279"/>
-    <w:pPr>
-      <w:tabs>
-        <w:tab w:val="center" w:pos="4680"/>
-        <w:tab w:val="right" w:pos="9360"/>
-      </w:tabs>
-      <w:spacing w:after="0" w:line="240" w:lineRule="auto"/>
-    </w:pPr>
-    <w:rPr>
-      <w:kern w:val="2"/>
-      <w:lang w:val="en-US"/>
-      <w14:ligatures w14:val="standardContextual"/>
-    </w:rPr>
-  </w:style>
-  <w:style w:type="character" w:customStyle="1" w:styleId="FooterChar">
-    <w:name w:val="Footer Char"/>
-    <w:basedOn w:val="DefaultParagraphFont"/>
-    <w:link w:val="Footer"/>
-    <w:uiPriority w:val="99"/>
-    <w:rsid w:val="00E63279"/>
-  </w:style>
-  <w:style w:type="character" w:customStyle="1" w:styleId="Heading1Char">
-    <w:name w:val="Heading 1 Char"/>
-    <w:basedOn w:val="DefaultParagraphFont"/>
-    <w:link w:val="Heading1"/>
-    <w:uiPriority w:val="9"/>
-    <w:rsid w:val="00E63279"/>
-    <w:rPr>
-      <w:rFonts w:asciiTheme="majorHAnsi" w:eastAsiaTheme="majorEastAsia" w:hAnsiTheme="majorHAnsi" w:cstheme="majorBidi"/>
-      <w:color w:val="2F5496" w:themeColor="accent1" w:themeShade="BF"/>
-      <w:kern w:val="0"/>
-      <w:sz w:val="32"/>
-      <w:szCs w:val="32"/>
-      <w:lang w:val="en-CA"/>
-      <w14:ligatures w14:val="none"/>
-    </w:rPr>
-  </w:style>
-  <w:style w:type="table" w:styleId="TableGrid">
-    <w:name w:val="Table Grid"/>
-    <w:basedOn w:val="TableNormal"/>
-    <w:uiPriority w:val="59"/>
-    <w:rsid w:val="00E63279"/>
-    <w:pPr>
-      <w:spacing w:after="0" w:line="240" w:lineRule="auto"/>
-    </w:pPr>
-    <w:rPr>
-      <w:kern w:val="0"/>
-      <w:lang w:val="en-CA"/>
-      <w14:ligatures w14:val="none"/>
-    </w:rPr>
-    <w:tblPr>
-      <w:tblBorders>
-        <w:top w:val="single" w:sz="4" w:space="0" w:color="auto"/>
-        <w:left w:val="single" w:sz="4" w:space="0" w:color="auto"/>
-        <w:bottom w:val="single" w:sz="4" w:space="0" w:color="auto"/>
-        <w:right w:val="single" w:sz="4" w:space="0" w:color="auto"/>
-        <w:insideH w:val="single" w:sz="4" w:space="0" w:color="auto"/>
-        <w:insideV w:val="single" w:sz="4" w:space="0" w:color="auto"/>
-      </w:tblBorders>
-    </w:tblPr>
-  </w:style>
-  <w:style w:type="paragraph" w:styleId="ListParagraph">
-    <w:name w:val="List Paragraph"/>
-    <w:basedOn w:val="Normal"/>
-    <w:uiPriority w:val="34"/>
-    <w:qFormat/>
-    <w:rsid w:val="00562CE4"/>
-    <w:pPr>
-      <w:ind w:left="720"/>
-      <w:contextualSpacing/>
-    </w:pPr>
-  </w:style>
-  <w:style w:type="paragraph" w:styleId="NormalWeb">
-    <w:name w:val="Normal (Web)"/>
-    <w:basedOn w:val="Normal"/>
-    <w:uiPriority w:val="99"/>
-    <w:unhideWhenUsed/>
-    <w:rsid w:val="00562CE4"/>
-    <w:pPr>
-      <w:spacing w:before="100" w:beforeAutospacing="1" w:after="100" w:afterAutospacing="1" w:line="240" w:lineRule="auto"/>
-    </w:pPr>
-    <w:rPr>
-      <w:rFonts w:ascii="Times New Roman" w:eastAsia="Times New Roman" w:hAnsi="Times New Roman" w:cs="Times New Roman"/>
-      <w:sz w:val="24"/>
-      <w:szCs w:val="24"/>
-    </w:rPr>
-  </w:style>
-</w:styles>
-</file>
-
-<file path=word/stylesWithEffects.xml><?xml version="1.0" encoding="utf-8"?>
-<w:styles xmlns:wpc="http://schemas.microsoft.com/office/word/2010/wordprocessingCanvas" xmlns:mc="http://schemas.openxmlformats.org/markup-compatibility/2006" xmlns:o="urn:schemas-microsoft-com:office:office" xmlns:r="http://schemas.openxmlformats.org/officeDocument/2006/relationships" xmlns:m="http://schemas.openxmlformats.org/officeDocument/2006/math" xmlns:v="urn:schemas-microsoft-com:vml" xmlns:wp14="http://schemas.microsoft.com/office/word/2010/wordprocessingDrawing" xmlns:wp="http://schemas.openxmlformats.org/drawingml/2006/wordprocessingDrawing" xmlns:w10="urn:schemas-microsoft-com:office:word" xmlns:w="http://schemas.openxmlformats.org/wordprocessingml/2006/main" xmlns:w14="http://schemas.microsoft.com/office/word/2010/wordml" xmlns:wpg="http://schemas.microsoft.com/office/word/2010/wordprocessingGroup" xmlns:wpi="http://schemas.microsoft.com/office/word/2010/wordprocessingInk" xmlns:wne="http://schemas.microsoft.com/office/word/2006/wordml" xmlns:wps="http://schemas.microsoft.com/office/word/2010/wordprocessingShape" mc:Ignorable="w14 wp14">
-  <w:docDefaults>
-    <w:rPrDefault>
-      <w:rPr>
-        <w:rFonts w:asciiTheme="minorHAnsi" w:eastAsiaTheme="minorHAnsi" w:hAnsiTheme="minorHAnsi" w:cstheme="minorBidi"/>
-        <w:kern w:val="2"/>
-        <w:sz w:val="22"/>
-        <w:szCs w:val="22"/>
-        <w:lang w:val="en-US" w:eastAsia="en-US" w:bidi="ar-SA"/>
-        <w14:ligatures w14:val="standardContextual"/>
-      </w:rPr>
-    </w:rPrDefault>
-    <w:pPrDefault>
-      <w:pPr>
-        <w:spacing w:after="160" w:line="259" w:lineRule="auto"/>
-      </w:pPr>
-    </w:pPrDefault>
-  </w:docDefaults>
-  <w:latentStyles w:defLockedState="0" w:defUIPriority="99" w:defSemiHidden="1" w:defUnhideWhenUsed="1" w:defQFormat="0" w:count="267">
-    <w:lsdException w:name="Normal" w:semiHidden="0" w:uiPriority="0" w:unhideWhenUsed="0" w:qFormat="1"/>
-    <w:lsdException w:name="heading 1" w:semiHidden="0" w:uiPriority="9" w:unhideWhenUsed="0" w:qFormat="1"/>
-    <w:lsdException w:name="heading 2" w:uiPriority="9" w:qFormat="1"/>
-    <w:lsdException w:name="heading 3" w:uiPriority="9" w:qFormat="1"/>
-    <w:lsdException w:name="heading 4" w:uiPriority="9" w:qFormat="1"/>
-    <w:lsdException w:name="heading 5" w:uiPriority="9" w:qFormat="1"/>
-    <w:lsdException w:name="heading 6" w:uiPriority="9" w:qFormat="1"/>
-    <w:lsdException w:name="heading 7" w:uiPriority="9" w:qFormat="1"/>
-    <w:lsdException w:name="heading 8" w:uiPriority="9" w:qFormat="1"/>
-    <w:lsdException w:name="heading 9" w:uiPriority="9" w:qFormat="1"/>
-    <w:lsdException w:name="toc 1" w:uiPriority="39"/>
-    <w:lsdException w:name="toc 2" w:uiPriority="39"/>
-    <w:lsdException w:name="toc 3" w:uiPriority="39"/>
-    <w:lsdException w:name="toc 4" w:uiPriority="39"/>
-    <w:lsdException w:name="toc 5" w:uiPriority="39"/>
-    <w:lsdException w:name="toc 6" w:uiPriority="39"/>
-    <w:lsdException w:name="toc 7" w:uiPriority="39"/>
-    <w:lsdException w:name="toc 8" w:uiPriority="39"/>
-    <w:lsdException w:name="toc 9" w:uiPriority="39"/>
-    <w:lsdException w:name="caption" w:uiPriority="35" w:qFormat="1"/>
-    <w:lsdException w:name="Title" w:semiHidden="0" w:uiPriority="10" w:unhideWhenUsed="0" w:qFormat="1"/>
-    <w:lsdException w:name="Default Paragraph Font" w:uiPriority="1"/>
-    <w:lsdException w:name="Subtitle" w:semiHidden="0" w:uiPriority="11" w:unhideWhenUsed="0" w:qFormat="1"/>
-    <w:lsdException w:name="Strong" w:semiHidden="0" w:uiPriority="22" w:unhideWhenUsed="0" w:qFormat="1"/>
-    <w:lsdException w:name="Emphasis" w:semiHidden="0" w:uiPriority="20" w:unhideWhenUsed="0" w:qFormat="1"/>
-    <w:lsdException w:name="Table Grid" w:semiHidden="0" w:uiPriority="59" w:unhideWhenUsed="0"/>
-    <w:lsdException w:name="Placeholder Text" w:unhideWhenUsed="0"/>
-    <w:lsdException w:name="No Spacing" w:semiHidden="0" w:uiPriority="1" w:unhideWhenUsed="0" w:qFormat="1"/>
-    <w:lsdException w:name="Light Shading" w:semiHidden="0" w:uiPriority="60" w:unhideWhenUsed="0"/>
-    <w:lsdException w:name="Light List" w:semiHidden="0" w:uiPriority="61" w:unhideWhenUsed="0"/>
-    <w:lsdException w:name="Light Grid" w:semiHidden="0" w:uiPriority="62" w:unhideWhenUsed="0"/>
-    <w:lsdException w:name="Medium Shading 1" w:semiHidden="0" w:uiPriority="63" w:unhideWhenUsed="0"/>
-    <w:lsdException w:name="Medium Shading 2" w:semiHidden="0" w:uiPriority="64" w:unhideWhenUsed="0"/>
-    <w:lsdException w:name="Medium List 1" w:semiHidden="0" w:uiPriority="65" w:unhideWhenUsed="0"/>
-    <w:lsdException w:name="Medium List 2" w:semiHidden="0" w:uiPriority="66" w:unhideWhenUsed="0"/>
-    <w:lsdException w:name="Medium Grid 1" w:semiHidden="0" w:uiPriority="67" w:unhideWhenUsed="0"/>
-    <w:lsdException w:name="Medium Grid 2" w:semiHidden="0" w:uiPriority="68" w:unhideWhenUsed="0"/>
-    <w:lsdException w:name="Medium Grid 3" w:semiHidden="0" w:uiPriority="69" w:unhideWhenUsed="0"/>
-    <w:lsdException w:name="Dark List" w:semiHidden="0" w:uiPriority="70" w:unhideWhenUsed="0"/>
-    <w:lsdException w:name="Colorful Shading" w:semiHidden="0" w:uiPriority="71" w:unhideWhenUsed="0"/>
-    <w:lsdException w:name="Colorful List" w:semiHidden="0" w:uiPriority="72" w:unhideWhenUsed="0"/>
-    <w:lsdException w:name="Colorful Grid" w:semiHidden="0" w:uiPriority="73" w:unhideWhenUsed="0"/>
-    <w:lsdException w:name="Light Shading Accent 1" w:semiHidden="0" w:uiPriority="60" w:unhideWhenUsed="0"/>
-    <w:lsdException w:name="Light List Accent 1" w:semiHidden="0" w:uiPriority="61" w:unhideWhenUsed="0"/>
-    <w:lsdException w:name="Light Grid Accent 1" w:semiHidden="0" w:uiPriority="62" w:unhideWhenUsed="0"/>
-    <w:lsdException w:name="Medium Shading 1 Accent 1" w:semiHidden="0" w:uiPriority="63" w:unhideWhenUsed="0"/>
-    <w:lsdException w:name="Medium Shading 2 Accent 1" w:semiHidden="0" w:uiPriority="64" w:unhideWhenUsed="0"/>
-    <w:lsdException w:name="Medium List 1 Accent 1" w:semiHidden="0" w:uiPriority="65" w:unhideWhenUsed="0"/>
-    <w:lsdException w:name="Revision" w:unhideWhenUsed="0"/>
-    <w:lsdException w:name="List Paragraph" w:semiHidden="0" w:uiPriority="34" w:unhideWhenUsed="0" w:qFormat="1"/>
-    <w:lsdException w:name="Quote" w:semiHidden="0" w:uiPriority="29" w:unhideWhenUsed="0" w:qFormat="1"/>
-    <w:lsdException w:name="Intense Quote" w:semiHidden="0" w:uiPriority="30" w:unhideWhenUsed="0" w:qFormat="1"/>
-    <w:lsdException w:name="Medium List 2 Accent 1" w:semiHidden="0" w:uiPriority="66" w:unhideWhenUsed="0"/>
-    <w:lsdException w:name="Medium Grid 1 Accent 1" w:semiHidden="0" w:uiPriority="67" w:unhideWhenUsed="0"/>
-    <w:lsdException w:name="Medium Grid 2 Accent 1" w:semiHidden="0" w:uiPriority="68" w:unhideWhenUsed="0"/>
-    <w:lsdException w:name="Medium Grid 3 Accent 1" w:semiHidden="0" w:uiPriority="69" w:unhideWhenUsed="0"/>
-    <w:lsdException w:name="Dark List Accent 1" w:semiHidden="0" w:uiPriority="70" w:unhideWhenUsed="0"/>
-    <w:lsdException w:name="Colorful Shading Accent 1" w:semiHidden="0" w:uiPriority="71" w:unhideWhenUsed="0"/>
-    <w:lsdException w:name="Colorful List Accent 1" w:semiHidden="0" w:uiPriority="72" w:unhideWhenUsed="0"/>
-    <w:lsdException w:name="Colorful Grid Accent 1" w:semiHidden="0" w:uiPriority="73" w:unhideWhenUsed="0"/>
-    <w:lsdException w:name="Light Shading Accent 2" w:semiHidden="0" w:uiPriority="60" w:unhideWhenUsed="0"/>
-    <w:lsdException w:name="Light List Accent 2" w:semiHidden="0" w:uiPriority="61" w:unhideWhenUsed="0"/>
-    <w:lsdException w:name="Light Grid Accent 2" w:semiHidden="0" w:uiPriority="62" w:unhideWhenUsed="0"/>
-    <w:lsdException w:name="Medium Shading 1 Accent 2" w:semiHidden="0" w:uiPriority="63" w:unhideWhenUsed="0"/>
-    <w:lsdException w:name="Medium Shading 2 Accent 2" w:semiHidden="0" w:uiPriority="64" w:unhideWhenUsed="0"/>
-    <w:lsdException w:name="Medium List 1 Accent 2" w:semiHidden="0" w:uiPriority="65" w:unhideWhenUsed="0"/>
-    <w:lsdException w:name="Medium List 2 Accent 2" w:semiHidden="0" w:uiPriority="66" w:unhideWhenUsed="0"/>
-    <w:lsdException w:name="Medium Grid 1 Accent 2" w:semiHidden="0" w:uiPriority="67" w:unhideWhenUsed="0"/>
-    <w:lsdException w:name="Medium Grid 2 Accent 2" w:semiHidden="0" w:uiPriority="68" w:unhideWhenUsed="0"/>
-    <w:lsdException w:name="Medium Grid 3 Accent 2" w:semiHidden="0" w:uiPriority="69" w:unhideWhenUsed="0"/>
-    <w:lsdException w:name="Dark List Accent 2" w:semiHidden="0" w:uiPriority="70" w:unhideWhenUsed="0"/>
-    <w:lsdException w:name="Colorful Shading Accent 2" w:semiHidden="0" w:uiPriority="71" w:unhideWhenUsed="0"/>
-    <w:lsdException w:name="Colorful List Accent 2" w:semiHidden="0" w:uiPriority="72" w:unhideWhenUsed="0"/>
-    <w:lsdException w:name="Colorful Grid Accent 2" w:semiHidden="0" w:uiPriority="73" w:unhideWhenUsed="0"/>
-    <w:lsdException w:name="Light Shading Accent 3" w:semiHidden="0" w:uiPriority="60" w:unhideWhenUsed="0"/>
-    <w:lsdException w:name="Light List Accent 3" w:semiHidden="0" w:uiPriority="61" w:unhideWhenUsed="0"/>
-    <w:lsdException w:name="Light Grid Accent 3" w:semiHidden="0" w:uiPriority="62" w:unhideWhenUsed="0"/>
-    <w:lsdException w:name="Medium Shading 1 Accent 3" w:semiHidden="0" w:uiPriority="63" w:unhideWhenUsed="0"/>
-    <w:lsdException w:name="Medium Shading 2 Accent 3" w:semiHidden="0" w:uiPriority="64" w:unhideWhenUsed="0"/>
-    <w:lsdException w:name="Medium List 1 Accent 3" w:semiHidden="0" w:uiPriority="65" w:unhideWhenUsed="0"/>
-    <w:lsdException w:name="Medium List 2 Accent 3" w:semiHidden="0" w:uiPriority="66" w:unhideWhenUsed="0"/>
-    <w:lsdException w:name="Medium Grid 1 Accent 3" w:semiHidden="0" w:uiPriority="67" w:unhideWhenUsed="0"/>
-    <w:lsdException w:name="Medium Grid 2 Accent 3" w:semiHidden="0" w:uiPriority="68" w:unhideWhenUsed="0"/>
-    <w:lsdException w:name="Medium Grid 3 Accent 3" w:semiHidden="0" w:uiPriority="69" w:unhideWhenUsed="0"/>
-    <w:lsdException w:name="Dark List Accent 3" w:semiHidden="0" w:uiPriority="70" w:unhideWhenUsed="0"/>
-    <w:lsdException w:name="Colorful Shading Accent 3" w:semiHidden="0" w:uiPriority="71" w:unhideWhenUsed="0"/>
-    <w:lsdException w:name="Colorful List Accent 3" w:semiHidden="0" w:uiPriority="72" w:unhideWhenUsed="0"/>
-    <w:lsdException w:name="Colorful Grid Accent 3" w:semiHidden="0" w:uiPriority="73" w:unhideWhenUsed="0"/>
-    <w:lsdException w:name="Light Shading Accent 4" w:semiHidden="0" w:uiPriority="60" w:unhideWhenUsed="0"/>
-    <w:lsdException w:name="Light List Accent 4" w:semiHidden="0" w:uiPriority="61" w:unhideWhenUsed="0"/>
-    <w:lsdException w:name="Light Grid Accent 4" w:semiHidden="0" w:uiPriority="62" w:unhideWhenUsed="0"/>
-    <w:lsdException w:name="Medium Shading 1 Accent 4" w:semiHidden="0" w:uiPriority="63" w:unhideWhenUsed="0"/>
-    <w:lsdException w:name="Medium Shading 2 Accent 4" w:semiHidden="0" w:uiPriority="64" w:unhideWhenUsed="0"/>
-    <w:lsdException w:name="Medium List 1 Accent 4" w:semiHidden="0" w:uiPriority="65" w:unhideWhenUsed="0"/>
-    <w:lsdException w:name="Medium List 2 Accent 4" w:semiHidden="0" w:uiPriority="66" w:unhideWhenUsed="0"/>
-    <w:lsdException w:name="Medium Grid 1 Accent 4" w:semiHidden="0" w:uiPriority="67" w:unhideWhenUsed="0"/>
-    <w:lsdException w:name="Medium Grid 2 Accent 4" w:semiHidden="0" w:uiPriority="68" w:unhideWhenUsed="0"/>
-    <w:lsdException w:name="Medium Grid 3 Accent 4" w:semiHidden="0" w:uiPriority="69" w:unhideWhenUsed="0"/>
-    <w:lsdException w:name="Dark List Accent 4" w:semiHidden="0" w:uiPriority="70" w:unhideWhenUsed="0"/>
-    <w:lsdException w:name="Colorful Shading Accent 4" w:semiHidden="0" w:uiPriority="71" w:unhideWhenUsed="0"/>
-    <w:lsdException w:name="Colorful List Accent 4" w:semiHidden="0" w:uiPriority="72" w:unhideWhenUsed="0"/>
-    <w:lsdException w:name="Colorful Grid Accent 4" w:semiHidden="0" w:uiPriority="73" w:unhideWhenUsed="0"/>
-    <w:lsdException w:name="Light Shading Accent 5" w:semiHidden="0" w:uiPriority="60" w:unhideWhenUsed="0"/>
-    <w:lsdException w:name="Light List Accent 5" w:semiHidden="0" w:uiPriority="61" w:unhideWhenUsed="0"/>
-    <w:lsdException w:name="Light Grid Accent 5" w:semiHidden="0" w:uiPriority="62" w:unhideWhenUsed="0"/>
-    <w:lsdException w:name="Medium Shading 1 Accent 5" w:semiHidden="0" w:uiPriority="63" w:unhideWhenUsed="0"/>
-    <w:lsdException w:name="Medium Shading 2 Accent 5" w:semiHidden="0" w:uiPriority="64" w:unhideWhenUsed="0"/>
-    <w:lsdException w:name="Medium List 1 Accent 5" w:semiHidden="0" w:uiPriority="65" w:unhideWhenUsed="0"/>
-    <w:lsdException w:name="Medium List 2 Accent 5" w:semiHidden="0" w:uiPriority="66" w:unhideWhenUsed="0"/>
-    <w:lsdException w:name="Medium Grid 1 Accent 5" w:semiHidden="0" w:uiPriority="67" w:unhideWhenUsed="0"/>
-    <w:lsdException w:name="Medium Grid 2 Accent 5" w:semiHidden="0" w:uiPriority="68" w:unhideWhenUsed="0"/>
-    <w:lsdException w:name="Medium Grid 3 Accent 5" w:semiHidden="0" w:uiPriority="69" w:unhideWhenUsed="0"/>
-    <w:lsdException w:name="Dark List Accent 5" w:semiHidden="0" w:uiPriority="70" w:unhideWhenUsed="0"/>
-    <w:lsdException w:name="Colorful Shading Accent 5" w:semiHidden="0" w:uiPriority="71" w:unhideWhenUsed="0"/>
-    <w:lsdException w:name="Colorful List Accent 5" w:semiHidden="0" w:uiPriority="72" w:unhideWhenUsed="0"/>
-    <w:lsdException w:name="Colorful Grid Accent 5" w:semiHidden="0" w:uiPriority="73" w:unhideWhenUsed="0"/>
-    <w:lsdException w:name="Light Shading Accent 6" w:semiHidden="0" w:uiPriority="60" w:unhideWhenUsed="0"/>
-    <w:lsdException w:name="Light List Accent 6" w:semiHidden="0" w:uiPriority="61" w:unhideWhenUsed="0"/>
-    <w:lsdException w:name="Light Grid Accent 6" w:semiHidden="0" w:uiPriority="62" w:unhideWhenUsed="0"/>
-    <w:lsdException w:name="Medium Shading 1 Accent 6" w:semiHidden="0" w:uiPriority="63" w:unhideWhenUsed="0"/>
-    <w:lsdException w:name="Medium Shading 2 Accent 6" w:semiHidden="0" w:uiPriority="64" w:unhideWhenUsed="0"/>
-    <w:lsdException w:name="Medium List 1 Accent 6" w:semiHidden="0" w:uiPriority="65" w:unhideWhenUsed="0"/>
-    <w:lsdException w:name="Medium List 2 Accent 6" w:semiHidden="0" w:uiPriority="66" w:unhideWhenUsed="0"/>
-    <w:lsdException w:name="Medium Grid 1 Accent 6" w:semiHidden="0" w:uiPriority="67" w:unhideWhenUsed="0"/>
-    <w:lsdException w:name="Medium Grid 2 Accent 6" w:semiHidden="0" w:uiPriority="68" w:unhideWhenUsed="0"/>
-    <w:lsdException w:name="Medium Grid 3 Accent 6" w:semiHidden="0" w:uiPriority="69" w:unhideWhenUsed="0"/>
-    <w:lsdException w:name="Dark List Accent 6" w:semiHidden="0" w:uiPriority="70" w:unhideWhenUsed="0"/>
-    <w:lsdException w:name="Colorful Shading Accent 6" w:semiHidden="0" w:uiPriority="71" w:unhideWhenUsed="0"/>
-    <w:lsdException w:name="Colorful List Accent 6" w:semiHidden="0" w:uiPriority="72" w:unhideWhenUsed="0"/>
-    <w:lsdException w:name="Colorful Grid Accent 6" w:semiHidden="0" w:uiPriority="73" w:unhideWhenUsed="0"/>
-    <w:lsdException w:name="Subtle Emphasis" w:semiHidden="0" w:uiPriority="19" w:unhideWhenUsed="0" w:qFormat="1"/>
-    <w:lsdException w:name="Intense Emphasis" w:semiHidden="0" w:uiPriority="21" w:unhideWhenUsed="0" w:qFormat="1"/>
-    <w:lsdException w:name="Subtle Reference" w:semiHidden="0" w:uiPriority="31" w:unhideWhenUsed="0" w:qFormat="1"/>
-    <w:lsdException w:name="Intense Reference" w:semiHidden="0" w:uiPriority="32" w:unhideWhenUsed="0" w:qFormat="1"/>
-    <w:lsdException w:name="Book Title" w:semiHidden="0" w:uiPriority="33" w:unhideWhenUsed="0" w:qFormat="1"/>
-    <w:lsdException w:name="Bibliography" w:uiPriority="37"/>
-    <w:lsdException w:name="TOC Heading" w:uiPriority="39" w:qFormat="1"/>
+  <w:latentStyles w:defLockedState="0" w:defUIPriority="99" w:defSemiHidden="0" w:defUnhideWhenUsed="0" w:defQFormat="0" w:count="376">
+    <w:lsdException w:name="Normal" w:uiPriority="0" w:qFormat="1"/>
+    <w:lsdException w:name="heading 1" w:uiPriority="9" w:qFormat="1"/>
+    <w:lsdException w:name="heading 2" w:semiHidden="1" w:uiPriority="9" w:unhideWhenUsed="1" w:qFormat="1"/>
+    <w:lsdException w:name="heading 3" w:semiHidden="1" w:uiPriority="9" w:unhideWhenUsed="1" w:qFormat="1"/>
+    <w:lsdException w:name="heading 4" w:semiHidden="1" w:uiPriority="9" w:unhideWhenUsed="1" w:qFormat="1"/>
+    <w:lsdException w:name="heading 5" w:semiHidden="1" w:uiPriority="9" w:unhideWhenUsed="1" w:qFormat="1"/>
+    <w:lsdException w:name="heading 6" w:semiHidden="1" w:uiPriority="9" w:unhideWhenUsed="1" w:qFormat="1"/>
+    <w:lsdException w:name="heading 7" w:semiHidden="1" w:uiPriority="9" w:unhideWhenUsed="1" w:qFormat="1"/>
+    <w:lsdException w:name="heading 8" w:semiHidden="1" w:uiPriority="9" w:unhideWhenUsed="1" w:qFormat="1"/>
+    <w:lsdException w:name="heading 9" w:semiHidden="1" w:uiPriority="9" w:unhideWhenUsed="1" w:qFormat="1"/>
+    <w:lsdException w:name="index 1" w:semiHidden="1" w:unhideWhenUsed="1"/>
+    <w:lsdException w:name="index 2" w:semiHidden="1" w:unhideWhenUsed="1"/>
+    <w:lsdException w:name="index 3" w:semiHidden="1" w:unhideWhenUsed="1"/>
+    <w:lsdException w:name="index 4" w:semiHidden="1" w:unhideWhenUsed="1"/>
+    <w:lsdException w:name="index 5" w:semiHidden="1" w:unhideWhenUsed="1"/>
+    <w:lsdException w:name="index 6" w:semiHidden="1" w:unhideWhenUsed="1"/>
+    <w:lsdException w:name="index 7" w:semiHidden="1" w:unhideWhenUsed="1"/>
+    <w:lsdException w:name="index 8" w:semiHidden="1" w:unhideWhenUsed="1"/>
+    <w:lsdException w:name="index 9" w:semiHidden="1" w:unhideWhenUsed="1"/>
+    <w:lsdException w:name="toc 1" w:semiHidden="1" w:uiPriority="39" w:unhideWhenUsed="1"/>
+    <w:lsdException w:name="toc 2" w:semiHidden="1" w:uiPriority="39" w:unhideWhenUsed="1"/>
+    <w:lsdException w:name="toc 3" w:semiHidden="1" w:uiPriority="39" w:unhideWhenUsed="1"/>
+    <w:lsdException w:name="toc 4" w:semiHidden="1" w:uiPriority="39" w:unhideWhenUsed="1"/>
+    <w:lsdException w:name="toc 5" w:semiHidden="1" w:uiPriority="39" w:unhideWhenUsed="1"/>
+    <w:lsdException w:name="toc 6" w:semiHidden="1" w:uiPriority="39" w:unhideWhenUsed="1"/>
+    <w:lsdException w:name="toc 7" w:semiHidden="1" w:uiPriority="39" w:unhideWhenUsed="1"/>
+    <w:lsdException w:name="toc 8" w:semiHidden="1" w:uiPriority="39" w:unhideWhenUsed="1"/>
+    <w:lsdException w:name="toc 9" w:semiHidden="1" w:uiPriority="39" w:unhideWhenUsed="1"/>
+    <w:lsdException w:name="Normal Indent" w:semiHidden="1" w:unhideWhenUsed="1"/>
+    <w:lsdException w:name="footnote text" w:semiHidden="1" w:unhideWhenUsed="1"/>
+    <w:lsdException w:name="annotation text" w:semiHidden="1" w:unhideWhenUsed="1"/>
+    <w:lsdException w:name="header" w:semiHidden="1" w:unhideWhenUsed="1"/>
+    <w:lsdException w:name="footer" w:semiHidden="1" w:unhideWhenUsed="1"/>
+    <w:lsdException w:name="index heading" w:semiHidden="1" w:unhideWhenUsed="1"/>
+    <w:lsdException w:name="caption" w:semiHidden="1" w:uiPriority="35" w:unhideWhenUsed="1" w:qFormat="1"/>
+    <w:lsdException w:name="table of figures" w:semiHidden="1" w:unhideWhenUsed="1"/>
+    <w:lsdException w:name="envelope address" w:semiHidden="1" w:unhideWhenUsed="1"/>
+    <w:lsdException w:name="envelope return" w:semiHidden="1" w:unhideWhenUsed="1"/>
+    <w:lsdException w:name="footnote reference" w:semiHidden="1" w:unhideWhenUsed="1"/>
+    <w:lsdException w:name="annotation reference" w:semiHidden="1" w:unhideWhenUsed="1"/>
+    <w:lsdException w:name="line number" w:semiHidden="1" w:unhideWhenUsed="1"/>
+    <w:lsdException w:name="page number" w:semiHidden="1" w:unhideWhenUsed="1"/>
+    <w:lsdException w:name="endnote reference" w:semiHidden="1" w:unhideWhenUsed="1"/>
+    <w:lsdException w:name="endnote text" w:semiHidden="1" w:unhideWhenUsed="1"/>
+    <w:lsdException w:name="table of authorities" w:semiHidden="1" w:unhideWhenUsed="1"/>
+    <w:lsdException w:name="macro" w:semiHidden="1" w:unhideWhenUsed="1"/>
+    <w:lsdException w:name="toa heading" w:semiHidden="1" w:unhideWhenUsed="1"/>
+    <w:lsdException w:name="List" w:semiHidden="1" w:unhideWhenUsed="1"/>
+    <w:lsdException w:name="List Bullet" w:semiHidden="1" w:unhideWhenUsed="1"/>
+    <w:lsdException w:name="List Number" w:semiHidden="1" w:unhideWhenUsed="1"/>
+    <w:lsdException w:name="List 2" w:semiHidden="1" w:unhideWhenUsed="1"/>
+    <w:lsdException w:name="List 3" w:semiHidden="1" w:unhideWhenUsed="1"/>
+    <w:lsdException w:name="List 4" w:semiHidden="1" w:unhideWhenUsed="1"/>
+    <w:lsdException w:name="List 5" w:semiHidden="1" w:unhideWhenUsed="1"/>
+    <w:lsdException w:name="List Bullet 2" w:semiHidden="1" w:unhideWhenUsed="1"/>
+    <w:lsdException w:name="List Bullet 3" w:semiHidden="1" w:unhideWhenUsed="1"/>
+    <w:lsdException w:name="List Bullet 4" w:semiHidden="1" w:unhideWhenUsed="1"/>
+    <w:lsdException w:name="List Bullet 5" w:semiHidden="1" w:unhideWhenUsed="1"/>
+    <w:lsdException w:name="List Number 2" w:semiHidden="1" w:unhideWhenUsed="1"/>
+    <w:lsdException w:name="List Number 3" w:semiHidden="1" w:unhideWhenUsed="1"/>
+    <w:lsdException w:name="List Number 4" w:semiHidden="1" w:unhideWhenUsed="1"/>
+    <w:lsdException w:name="List Number 5" w:semiHidden="1" w:unhideWhenUsed="1"/>
+    <w:lsdException w:name="Title" w:uiPriority="10" w:qFormat="1"/>
+    <w:lsdException w:name="Closing" w:semiHidden="1" w:unhideWhenUsed="1"/>
+    <w:lsdException w:name="Signature" w:semiHidden="1" w:unhideWhenUsed="1"/>
+    <w:lsdException w:name="Default Paragraph Font" w:semiHidden="1" w:uiPriority="1" w:unhideWhenUsed="1"/>
+    <w:lsdException w:name="Body Text" w:semiHidden="1" w:unhideWhenUsed="1"/>
+    <w:lsdException w:name="Body Text Indent" w:semiHidden="1" w:unhideWhenUsed="1"/>
+    <w:lsdException w:name="List Continue" w:semiHidden="1" w:unhideWhenUsed="1"/>
+    <w:lsdException w:name="List Continue 2" w:semiHidden="1" w:unhideWhenUsed="1"/>
+    <w:lsdException w:name="List Continue 3" w:semiHidden="1" w:unhideWhenUsed="1"/>
+    <w:lsdException w:name="List Continue 4" w:semiHidden="1" w:unhideWhenUsed="1"/>
+    <w:lsdException w:name="List Continue 5" w:semiHidden="1" w:unhideWhenUsed="1"/>
+    <w:lsdException w:name="Message Header" w:semiHidden="1" w:unhideWhenUsed="1"/>
+    <w:lsdException w:name="Subtitle" w:uiPriority="11" w:qFormat="1"/>
+    <w:lsdException w:name="Salutation" w:semiHidden="1" w:unhideWhenUsed="1"/>
+    <w:lsdException w:name="Date" w:semiHidden="1" w:unhideWhenUsed="1"/>
+    <w:lsdException w:name="Body Text First Indent" w:semiHidden="1" w:unhideWhenUsed="1"/>
+    <w:lsdException w:name="Body Text First Indent 2" w:semiHidden="1" w:unhideWhenUsed="1"/>
+    <w:lsdException w:name="Note Heading" w:semiHidden="1" w:unhideWhenUsed="1"/>
+    <w:lsdException w:name="Body Text 2" w:semiHidden="1" w:unhideWhenUsed="1"/>
+    <w:lsdException w:name="Body Text 3" w:semiHidden="1" w:unhideWhenUsed="1"/>
+    <w:lsdException w:name="Body Text Indent 2" w:semiHidden="1" w:unhideWhenUsed="1"/>
+    <w:lsdException w:name="Body Text Indent 3" w:semiHidden="1" w:unhideWhenUsed="1"/>
+    <w:lsdException w:name="Block Text" w:semiHidden="1" w:unhideWhenUsed="1"/>
+    <w:lsdException w:name="Hyperlink" w:semiHidden="1" w:unhideWhenUsed="1"/>
+    <w:lsdException w:name="FollowedHyperlink" w:semiHidden="1" w:unhideWhenUsed="1"/>
+    <w:lsdException w:name="Strong" w:uiPriority="22" w:qFormat="1"/>
+    <w:lsdException w:name="Emphasis" w:uiPriority="20" w:qFormat="1"/>
+    <w:lsdException w:name="Document Map" w:semiHidden="1" w:unhideWhenUsed="1"/>
+    <w:lsdException w:name="Plain Text" w:semiHidden="1" w:unhideWhenUsed="1"/>
+    <w:lsdException w:name="E-mail Signature" w:semiHidden="1" w:unhideWhenUsed="1"/>
+    <w:lsdException w:name="HTML Top of Form" w:semiHidden="1" w:unhideWhenUsed="1"/>
+    <w:lsdException w:name="HTML Bottom of Form" w:semiHidden="1" w:unhideWhenUsed="1"/>
+    <w:lsdException w:name="Normal (Web)" w:semiHidden="1" w:unhideWhenUsed="1"/>
+    <w:lsdException w:name="HTML Acronym" w:semiHidden="1" w:unhideWhenUsed="1"/>
+    <w:lsdException w:name="HTML Address" w:semiHidden="1" w:unhideWhenUsed="1"/>
+    <w:lsdException w:name="HTML Cite" w:semiHidden="1" w:unhideWhenUsed="1"/>
+    <w:lsdException w:name="HTML Code" w:semiHidden="1" w:unhideWhenUsed="1"/>
+    <w:lsdException w:name="HTML Definition" w:semiHidden="1" w:unhideWhenUsed="1"/>
+    <w:lsdException w:name="HTML Keyboard" w:semiHidden="1" w:unhideWhenUsed="1"/>
+    <w:lsdException w:name="HTML Preformatted" w:semiHidden="1" w:unhideWhenUsed="1"/>
+    <w:lsdException w:name="HTML Sample" w:semiHidden="1" w:unhideWhenUsed="1"/>
+    <w:lsdException w:name="HTML Typewriter" w:semiHidden="1" w:unhideWhenUsed="1"/>
+    <w:lsdException w:name="HTML Variable" w:semiHidden="1" w:unhideWhenUsed="1"/>
+    <w:lsdException w:name="Normal Table" w:semiHidden="1" w:unhideWhenUsed="1"/>
+    <w:lsdException w:name="annotation subject" w:semiHidden="1" w:unhideWhenUsed="1"/>
+    <w:lsdException w:name="No List" w:semiHidden="1" w:unhideWhenUsed="1"/>
+    <w:lsdException w:name="Outline List 1" w:semiHidden="1" w:unhideWhenUsed="1"/>
+    <w:lsdException w:name="Outline List 2" w:semiHidden="1" w:unhideWhenUsed="1"/>
+    <w:lsdException w:name="Outline List 3" w:semiHidden="1" w:unhideWhenUsed="1"/>
+    <w:lsdException w:name="Table Simple 1" w:semiHidden="1" w:unhideWhenUsed="1"/>
+    <w:lsdException w:name="Table Simple 2" w:semiHidden="1" w:unhideWhenUsed="1"/>
+    <w:lsdException w:name="Table Simple 3" w:semiHidden="1" w:unhideWhenUsed="1"/>
+    <w:lsdException w:name="Table Classic 1" w:semiHidden="1" w:unhideWhenUsed="1"/>
+    <w:lsdException w:name="Table Classic 2" w:semiHidden="1" w:unhideWhenUsed="1"/>
+    <w:lsdException w:name="Table Classic 3" w:semiHidden="1" w:unhideWhenUsed="1"/>
+    <w:lsdException w:name="Table Classic 4" w:semiHidden="1" w:unhideWhenUsed="1"/>
+    <w:lsdException w:name="Table Colorful 1" w:semiHidden="1" w:unhideWhenUsed="1"/>
+    <w:lsdException w:name="Table Colorful 2" w:semiHidden="1" w:unhideWhenUsed="1"/>
+    <w:lsdException w:name="Table Colorful 3" w:semiHidden="1" w:unhideWhenUsed="1"/>
+    <w:lsdException w:name="Table Columns 1" w:semiHidden="1" w:unhideWhenUsed="1"/>
+    <w:lsdException w:name="Table Columns 2" w:semiHidden="1" w:unhideWhenUsed="1"/>
+    <w:lsdException w:name="Table Columns 3" w:semiHidden="1" w:unhideWhenUsed="1"/>
+    <w:lsdException w:name="Table Columns 4" w:semiHidden="1" w:unhideWhenUsed="1"/>
+    <w:lsdException w:name="Table Columns 5" w:semiHidden="1" w:unhideWhenUsed="1"/>
+    <w:lsdException w:name="Table Grid 1" w:semiHidden="1" w:unhideWhenUsed="1"/>
+    <w:lsdException w:name="Table Grid 2" w:semiHidden="1" w:unhideWhenUsed="1"/>
+    <w:lsdException w:name="Table Grid 3" w:semiHidden="1" w:unhideWhenUsed="1"/>
+    <w:lsdException w:name="Table Grid 4" w:semiHidden="1" w:unhideWhenUsed="1"/>
+    <w:lsdException w:name="Table Grid 5" w:semiHidden="1" w:unhideWhenUsed="1"/>
+    <w:lsdException w:name="Table Grid 6" w:semiHidden="1" w:unhideWhenUsed="1"/>
+    <w:lsdException w:name="Table Grid 7" w:semiHidden="1" w:unhideWhenUsed="1"/>
+    <w:lsdException w:name="Table Grid 8" w:semiHidden="1" w:unhideWhenUsed="1"/>
+    <w:lsdException w:name="Table List 1" w:semiHidden="1" w:unhideWhenUsed="1"/>
+    <w:lsdException w:name="Table List 2" w:semiHidden="1" w:unhideWhenUsed="1"/>
+    <w:lsdException w:name="Table List 3" w:semiHidden="1" w:unhideWhenUsed="1"/>
+    <w:lsdException w:name="Table List 4" w:semiHidden="1" w:unhideWhenUsed="1"/>
+    <w:lsdException w:name="Table List 5" w:semiHidden="1" w:unhideWhenUsed="1"/>
+    <w:lsdException w:name="Table List 6" w:semiHidden="1" w:unhideWhenUsed="1"/>
+    <w:lsdException w:name="Table List 7" w:semiHidden="1" w:unhideWhenUsed="1"/>
+    <w:lsdException w:name="Table List 8" w:semiHidden="1" w:unhideWhenUsed="1"/>
+    <w:lsdException w:name="Table 3D effects 1" w:semiHidden="1" w:unhideWhenUsed="1"/>
+    <w:lsdException w:name="Table 3D effects 2" w:semiHidden="1" w:unhideWhenUsed="1"/>
+    <w:lsdException w:name="Table 3D effects 3" w:semiHidden="1" w:unhideWhenUsed="1"/>
+    <w:lsdException w:name="Table Contemporary" w:semiHidden="1" w:unhideWhenUsed="1"/>
+    <w:lsdException w:name="Table Elegant" w:semiHidden="1" w:unhideWhenUsed="1"/>
+    <w:lsdException w:name="Table Professional" w:semiHidden="1" w:unhideWhenUsed="1"/>
+    <w:lsdException w:name="Table Subtle 1" w:semiHidden="1" w:unhideWhenUsed="1"/>
+    <w:lsdException w:name="Table Subtle 2" w:semiHidden="1" w:unhideWhenUsed="1"/>
+    <w:lsdException w:name="Table Web 1" w:semiHidden="1" w:unhideWhenUsed="1"/>
+    <w:lsdException w:name="Table Web 2" w:semiHidden="1" w:unhideWhenUsed="1"/>
+    <w:lsdException w:name="Table Web 3" w:semiHidden="1" w:unhideWhenUsed="1"/>
+    <w:lsdException w:name="Balloon Text" w:semiHidden="1" w:unhideWhenUsed="1"/>
+    <w:lsdException w:name="Table Grid" w:uiPriority="59"/>
+    <w:lsdException w:name="Table Theme" w:semiHidden="1" w:unhideWhenUsed="1"/>
+    <w:lsdException w:name="Placeholder Text" w:semiHidden="1"/>
+    <w:lsdException w:name="No Spacing" w:uiPriority="1" w:qFormat="1"/>
+    <w:lsdException w:name="Light Shading" w:uiPriority="60"/>
+    <w:lsdException w:name="Light List" w:uiPriority="61"/>
+    <w:lsdException w:name="Light Grid" w:uiPriority="62"/>
+    <w:lsdException w:name="Medium Shading 1" w:uiPriority="63"/>
+    <w:lsdException w:name="Medium Shading 2" w:uiPriority="64"/>
+    <w:lsdException w:name="Medium List 1" w:uiPriority="65"/>
+    <w:lsdException w:name="Medium List 2" w:uiPriority="66"/>
+    <w:lsdException w:name="Medium Grid 1" w:uiPriority="67"/>
+    <w:lsdException w:name="Medium Grid 2" w:uiPriority="68"/>
+    <w:lsdException w:name="Medium Grid 3" w:uiPriority="69"/>
+    <w:lsdException w:name="Dark List" w:uiPriority="70"/>
+    <w:lsdException w:name="Colorful Shading" w:uiPriority="71"/>
+    <w:lsdException w:name="Colorful List" w:uiPriority="72"/>
+    <w:lsdException w:name="Colorful Grid" w:uiPriority="73"/>
+    <w:lsdException w:name="Light Shading Accent 1" w:uiPriority="60"/>
+    <w:lsdException w:name="Light List Accent 1" w:uiPriority="61"/>
+    <w:lsdException w:name="Light Grid Accent 1" w:uiPriority="62"/>
+    <w:lsdException w:name="Medium Shading 1 Accent 1" w:uiPriority="63"/>
+    <w:lsdException w:name="Medium Shading 2 Accent 1" w:uiPriority="64"/>
+    <w:lsdException w:name="Medium List 1 Accent 1" w:uiPriority="65"/>
+    <w:lsdException w:name="Revision" w:semiHidden="1"/>
+    <w:lsdException w:name="List Paragraph" w:uiPriority="34" w:qFormat="1"/>
+    <w:lsdException w:name="Quote" w:uiPriority="29" w:qFormat="1"/>
+    <w:lsdException w:name="Intense Quote" w:uiPriority="30" w:qFormat="1"/>
+    <w:lsdException w:name="Medium List 2 Accent 1" w:uiPriority="66"/>
+    <w:lsdException w:name="Medium Grid 1 Accent 1" w:uiPriority="67"/>
+    <w:lsdException w:name="Medium Grid 2 Accent 1" w:uiPriority="68"/>
+    <w:lsdException w:name="Medium Grid 3 Accent 1" w:uiPriority="69"/>
+    <w:lsdException w:name="Dark List Accent 1" w:uiPriority="70"/>
+    <w:lsdException w:name="Colorful Shading Accent 1" w:uiPriority="71"/>
+    <w:lsdException w:name="Colorful List Accent 1" w:uiPriority="72"/>
+    <w:lsdException w:name="Colorful Grid Accent 1" w:uiPriority="73"/>
+    <w:lsdException w:name="Light Shading Accent 2" w:uiPriority="60"/>
+    <w:lsdException w:name="Light List Accent 2" w:uiPriority="61"/>
+    <w:lsdException w:name="Light Grid Accent 2" w:uiPriority="62"/>
+    <w:lsdException w:name="Medium Shading 1 Accent 2" w:uiPriority="63"/>
+    <w:lsdException w:name="Medium Shading 2 Accent 2" w:uiPriority="64"/>
+    <w:lsdException w:name="Medium List 1 Accent 2" w:uiPriority="65"/>
+    <w:lsdException w:name="Medium List 2 Accent 2" w:uiPriority="66"/>
+    <w:lsdException w:name="Medium Grid 1 Accent 2" w:uiPriority="67"/>
+    <w:lsdException w:name="Medium Grid 2 Accent 2" w:uiPriority="68"/>
+    <w:lsdException w:name="Medium Grid 3 Accent 2" w:uiPriority="69"/>
+    <w:lsdException w:name="Dark List Accent 2" w:uiPriority="70"/>
+    <w:lsdException w:name="Colorful Shading Accent 2" w:uiPriority="71"/>
+    <w:lsdException w:name="Colorful List Accent 2" w:uiPriority="72"/>
+    <w:lsdException w:name="Colorful Grid Accent 2" w:uiPriority="73"/>
+    <w:lsdException w:name="Light Shading Accent 3" w:uiPriority="60"/>
+    <w:lsdException w:name="Light List Accent 3" w:uiPriority="61"/>
+    <w:lsdException w:name="Light Grid Accent 3" w:uiPriority="62"/>
+    <w:lsdException w:name="Medium Shading 1 Accent 3" w:uiPriority="63"/>
+    <w:lsdException w:name="Medium Shading 2 Accent 3" w:uiPriority="64"/>
+    <w:lsdException w:name="Medium List 1 Accent 3" w:uiPriority="65"/>
+    <w:lsdException w:name="Medium List 2 Accent 3" w:uiPriority="66"/>
+    <w:lsdException w:name="Medium Grid 1 Accent 3" w:uiPriority="67"/>
+    <w:lsdException w:name="Medium Grid 2 Accent 3" w:uiPriority="68"/>
+    <w:lsdException w:name="Medium Grid 3 Accent 3" w:uiPriority="69"/>
+    <w:lsdException w:name="Dark List Accent 3" w:uiPriority="70"/>
+    <w:lsdException w:name="Colorful Shading Accent 3" w:uiPriority="71"/>
+    <w:lsdException w:name="Colorful List Accent 3" w:uiPriority="72"/>
+    <w:lsdException w:name="Colorful Grid Accent 3" w:uiPriority="73"/>
+    <w:lsdException w:name="Light Shading Accent 4" w:uiPriority="60"/>
+    <w:lsdException w:name="Light List Accent 4" w:uiPriority="61"/>
+    <w:lsdException w:name="Light Grid Accent 4" w:uiPriority="62"/>
+    <w:lsdException w:name="Medium Shading 1 Accent 4" w:uiPriority="63"/>
+    <w:lsdException w:name="Medium Shading 2 Accent 4" w:uiPriority="64"/>
+    <w:lsdException w:name="Medium List 1 Accent 4" w:uiPriority="65"/>
+    <w:lsdException w:name="Medium List 2 Accent 4" w:uiPriority="66"/>
+    <w:lsdException w:name="Medium Grid 1 Accent 4" w:uiPriority="67"/>
+    <w:lsdException w:name="Medium Grid 2 Accent 4" w:uiPriority="68"/>
+    <w:lsdException w:name="Medium Grid 3 Accent 4" w:uiPriority="69"/>
+    <w:lsdException w:name="Dark List Accent 4" w:uiPriority="70"/>
+    <w:lsdException w:name="Colorful Shading Accent 4" w:uiPriority="71"/>
+    <w:lsdException w:name="Colorful List Accent 4" w:uiPriority="72"/>
+    <w:lsdException w:name="Colorful Grid Accent 4" w:uiPriority="73"/>
+    <w:lsdException w:name="Light Shading Accent 5" w:uiPriority="60"/>
+    <w:lsdException w:name="Light List Accent 5" w:uiPriority="61"/>
+    <w:lsdException w:name="Light Grid Accent 5" w:uiPriority="62"/>
+    <w:lsdException w:name="Medium Shading 1 Accent 5" w:uiPriority="63"/>
+    <w:lsdException w:name="Medium Shading 2 Accent 5" w:uiPriority="64"/>
+    <w:lsdException w:name="Medium List 1 Accent 5" w:uiPriority="65"/>
+    <w:lsdException w:name="Medium List 2 Accent 5" w:uiPriority="66"/>
+    <w:lsdException w:name="Medium Grid 1 Accent 5" w:uiPriority="67"/>
+    <w:lsdException w:name="Medium Grid 2 Accent 5" w:uiPriority="68"/>
+    <w:lsdException w:name="Medium Grid 3 Accent 5" w:uiPriority="69"/>
+    <w:lsdException w:name="Dark List Accent 5" w:uiPriority="70"/>
+    <w:lsdException w:name="Colorful Shading Accent 5" w:uiPriority="71"/>
+    <w:lsdException w:name="Colorful List Accent 5" w:uiPriority="72"/>
+    <w:lsdException w:name="Colorful Grid Accent 5" w:uiPriority="73"/>
+    <w:lsdException w:name="Light Shading Accent 6" w:uiPriority="60"/>
+    <w:lsdException w:name="Light List Accent 6" w:uiPriority="61"/>
+    <w:lsdException w:name="Light Grid Accent 6" w:uiPriority="62"/>
+    <w:lsdException w:name="Medium Shading 1 Accent 6" w:uiPriority="63"/>
+    <w:lsdException w:name="Medium Shading 2 Accent 6" w:uiPriority="64"/>
+    <w:lsdException w:name="Medium List 1 Accent 6" w:uiPriority="65"/>
+    <w:lsdException w:name="Medium List 2 Accent 6" w:uiPriority="66"/>
+    <w:lsdException w:name="Medium Grid 1 Accent 6" w:uiPriority="67"/>
+    <w:lsdException w:name="Medium Grid 2 Accent 6" w:uiPriority="68"/>
+    <w:lsdException w:name="Medium Grid 3 Accent 6" w:uiPriority="69"/>
+    <w:lsdException w:name="Dark List Accent 6" w:uiPriority="70"/>
+    <w:lsdException w:name="Colorful Shading Accent 6" w:uiPriority="71"/>
+    <w:lsdException w:name="Colorful List Accent 6" w:uiPriority="72"/>
+    <w:lsdException w:name="Colorful Grid Accent 6" w:uiPriority="73"/>
+    <w:lsdException w:name="Subtle Emphasis" w:uiPriority="19" w:qFormat="1"/>
+    <w:lsdException w:name="Intense Emphasis" w:uiPriority="21" w:qFormat="1"/>
+    <w:lsdException w:name="Subtle Reference" w:uiPriority="31" w:qFormat="1"/>
+    <w:lsdException w:name="Intense Reference" w:uiPriority="32" w:qFormat="1"/>
+    <w:lsdException w:name="Book Title" w:uiPriority="33" w:qFormat="1"/>
+    <w:lsdException w:name="Bibliography" w:semiHidden="1" w:uiPriority="37" w:unhideWhenUsed="1"/>
+    <w:lsdException w:name="TOC Heading" w:semiHidden="1" w:uiPriority="39" w:unhideWhenUsed="1" w:qFormat="1"/>
+    <w:lsdException w:name="Plain Table 1" w:uiPriority="41"/>
+    <w:lsdException w:name="Plain Table 2" w:uiPriority="42"/>
+    <w:lsdException w:name="Plain Table 3" w:uiPriority="43"/>
+    <w:lsdException w:name="Plain Table 4" w:uiPriority="44"/>
+    <w:lsdException w:name="Plain Table 5" w:uiPriority="45"/>
+    <w:lsdException w:name="Grid Table Light" w:uiPriority="40"/>
+    <w:lsdException w:name="Grid Table 1 Light" w:uiPriority="46"/>
+    <w:lsdException w:name="Grid Table 2" w:uiPriority="47"/>
+    <w:lsdException w:name="Grid Table 3" w:uiPriority="48"/>
+    <w:lsdException w:name="Grid Table 4" w:uiPriority="49"/>
+    <w:lsdException w:name="Grid Table 5 Dark" w:uiPriority="50"/>
+    <w:lsdException w:name="Grid Table 6 Colorful" w:uiPriority="51"/>
+    <w:lsdException w:name="Grid Table 7 Colorful" w:uiPriority="52"/>
+    <w:lsdException w:name="Grid Table 1 Light Accent 1" w:uiPriority="46"/>
+    <w:lsdException w:name="Grid Table 2 Accent 1" w:uiPriority="47"/>
+    <w:lsdException w:name="Grid Table 3 Accent 1" w:uiPriority="48"/>
+    <w:lsdException w:name="Grid Table 4 Accent 1" w:uiPriority="49"/>
+    <w:lsdException w:name="Grid Table 5 Dark Accent 1" w:uiPriority="50"/>
+    <w:lsdException w:name="Grid Table 6 Colorful Accent 1" w:uiPriority="51"/>
+    <w:lsdException w:name="Grid Table 7 Colorful Accent 1" w:uiPriority="52"/>
+    <w:lsdException w:name="Grid Table 1 Light Accent 2" w:uiPriority="46"/>
+    <w:lsdException w:name="Grid Table 2 Accent 2" w:uiPriority="47"/>
+    <w:lsdException w:name="Grid Table 3 Accent 2" w:uiPriority="48"/>
+    <w:lsdException w:name="Grid Table 4 Accent 2" w:uiPriority="49"/>
+    <w:lsdException w:name="Grid Table 5 Dark Accent 2" w:uiPriority="50"/>
+    <w:lsdException w:name="Grid Table 6 Colorful Accent 2" w:uiPriority="51"/>
+    <w:lsdException w:name="Grid Table 7 Colorful Accent 2" w:uiPriority="52"/>
+    <w:lsdException w:name="Grid Table 1 Light Accent 3" w:uiPriority="46"/>
+    <w:lsdException w:name="Grid Table 2 Accent 3" w:uiPriority="47"/>
+    <w:lsdException w:name="Grid Table 3 Accent 3" w:uiPriority="48"/>
+    <w:lsdException w:name="Grid Table 4 Accent 3" w:uiPriority="49"/>
+    <w:lsdException w:name="Grid Table 5 Dark Accent 3" w:uiPriority="50"/>
+    <w:lsdException w:name="Grid Table 6 Colorful Accent 3" w:uiPriority="51"/>
+    <w:lsdException w:name="Grid Table 7 Colorful Accent 3" w:uiPriority="52"/>
+    <w:lsdException w:name="Grid Table 1 Light Accent 4" w:uiPriority="46"/>
+    <w:lsdException w:name="Grid Table 2 Accent 4" w:uiPriority="47"/>
+    <w:lsdException w:name="Grid Table 3 Accent 4" w:uiPriority="48"/>
+    <w:lsdException w:name="Grid Table 4 Accent 4" w:uiPriority="49"/>
+    <w:lsdException w:name="Grid Table 5 Dark Accent 4" w:uiPriority="50"/>
+    <w:lsdException w:name="Grid Table 6 Colorful Accent 4" w:uiPriority="51"/>
+    <w:lsdException w:name="Grid Table 7 Colorful Accent 4" w:uiPriority="52"/>
+    <w:lsdException w:name="Grid Table 1 Light Accent 5" w:uiPriority="46"/>
+    <w:lsdException w:name="Grid Table 2 Accent 5" w:uiPriority="47"/>
+    <w:lsdException w:name="Grid Table 3 Accent 5" w:uiPriority="48"/>
+    <w:lsdException w:name="Grid Table 4 Accent 5" w:uiPriority="49"/>
+    <w:lsdException w:name="Grid Table 5 Dark Accent 5" w:uiPriority="50"/>
+    <w:lsdException w:name="Grid Table 6 Colorful Accent 5" w:uiPriority="51"/>
+    <w:lsdException w:name="Grid Table 7 Colorful Accent 5" w:uiPriority="52"/>
+    <w:lsdException w:name="Grid Table 1 Light Accent 6" w:uiPriority="46"/>
+    <w:lsdException w:name="Grid Table 2 Accent 6" w:uiPriority="47"/>
+    <w:lsdException w:name="Grid Table 3 Accent 6" w:uiPriority="48"/>
+    <w:lsdException w:name="Grid Table 4 Accent 6" w:uiPriority="49"/>
+    <w:lsdException w:name="Grid Table 5 Dark Accent 6" w:uiPriority="50"/>
+    <w:lsdException w:name="Grid Table 6 Colorful Accent 6" w:uiPriority="51"/>
+    <w:lsdException w:name="Grid Table 7 Colorful Accent 6" w:uiPriority="52"/>
+    <w:lsdException w:name="List Table 1 Light" w:uiPriority="46"/>
+    <w:lsdException w:name="List Table 2" w:uiPriority="47"/>
+    <w:lsdException w:name="List Table 3" w:uiPriority="48"/>
+    <w:lsdException w:name="List Table 4" w:uiPriority="49"/>
+    <w:lsdException w:name="List Table 5 Dark" w:uiPriority="50"/>
+    <w:lsdException w:name="List Table 6 Colorful" w:uiPriority="51"/>
+    <w:lsdException w:name="List Table 7 Colorful" w:uiPriority="52"/>
+    <w:lsdException w:name="List Table 1 Light Accent 1" w:uiPriority="46"/>
+    <w:lsdException w:name="List Table 2 Accent 1" w:uiPriority="47"/>
+    <w:lsdException w:name="List Table 3 Accent 1" w:uiPriority="48"/>
+    <w:lsdException w:name="List Table 4 Accent 1" w:uiPriority="49"/>
+    <w:lsdException w:name="List Table 5 Dark Accent 1" w:uiPriority="50"/>
+    <w:lsdException w:name="List Table 6 Colorful Accent 1" w:uiPriority="51"/>
+    <w:lsdException w:name="List Table 7 Colorful Accent 1" w:uiPriority="52"/>
+    <w:lsdException w:name="List Table 1 Light Accent 2" w:uiPriority="46"/>
+    <w:lsdException w:name="List Table 2 Accent 2" w:uiPriority="47"/>
+    <w:lsdException w:name="List Table 3 Accent 2" w:uiPriority="48"/>
+    <w:lsdException w:name="List Table 4 Accent 2" w:uiPriority="49"/>
+    <w:lsdException w:name="List Table 5 Dark Accent 2" w:uiPriority="50"/>
+    <w:lsdException w:name="List Table 6 Colorful Accent 2" w:uiPriority="51"/>
+    <w:lsdException w:name="List Table 7 Colorful Accent 2" w:uiPriority="52"/>
+    <w:lsdException w:name="List Table 1 Light Accent 3" w:uiPriority="46"/>
+    <w:lsdException w:name="List Table 2 Accent 3" w:uiPriority="47"/>
+    <w:lsdException w:name="List Table 3 Accent 3" w:uiPriority="48"/>
+    <w:lsdException w:name="List Table 4 Accent 3" w:uiPriority="49"/>
+    <w:lsdException w:name="List Table 5 Dark Accent 3" w:uiPriority="50"/>
+    <w:lsdException w:name="List Table 6 Colorful Accent 3" w:uiPriority="51"/>
+    <w:lsdException w:name="List Table 7 Colorful Accent 3" w:uiPriority="52"/>
+    <w:lsdException w:name="List Table 1 Light Accent 4" w:uiPriority="46"/>
+    <w:lsdException w:name="List Table 2 Accent 4" w:uiPriority="47"/>
+    <w:lsdException w:name="List Table 3 Accent 4" w:uiPriority="48"/>
+    <w:lsdException w:name="List Table 4 Accent 4" w:uiPriority="49"/>
+    <w:lsdException w:name="List Table 5 Dark Accent 4" w:uiPriority="50"/>
+    <w:lsdException w:name="List Table 6 Colorful Accent 4" w:uiPriority="51"/>
+    <w:lsdException w:name="List Table 7 Colorful Accent 4" w:uiPriority="52"/>
+    <w:lsdException w:name="List Table 1 Light Accent 5" w:uiPriority="46"/>
+    <w:lsdException w:name="List Table 2 Accent 5" w:uiPriority="47"/>
+    <w:lsdException w:name="List Table 3 Accent 5" w:uiPriority="48"/>
+    <w:lsdException w:name="List Table 4 Accent 5" w:uiPriority="49"/>
+    <w:lsdException w:name="List Table 5 Dark Accent 5" w:uiPriority="50"/>
+    <w:lsdException w:name="List Table 6 Colorful Accent 5" w:uiPriority="51"/>
+    <w:lsdException w:name="List Table 7 Colorful Accent 5" w:uiPriority="52"/>
+    <w:lsdException w:name="List Table 1 Light Accent 6" w:uiPriority="46"/>
+    <w:lsdException w:name="List Table 2 Accent 6" w:uiPriority="47"/>
+    <w:lsdException w:name="List Table 3 Accent 6" w:uiPriority="48"/>
+    <w:lsdException w:name="List Table 4 Accent 6" w:uiPriority="49"/>
+    <w:lsdException w:name="List Table 5 Dark Accent 6" w:uiPriority="50"/>
+    <w:lsdException w:name="List Table 6 Colorful Accent 6" w:uiPriority="51"/>
+    <w:lsdException w:name="List Table 7 Colorful Accent 6" w:uiPriority="52"/>
+    <w:lsdException w:name="Mention" w:semiHidden="1" w:unhideWhenUsed="1"/>
+    <w:lsdException w:name="Smart Hyperlink" w:semiHidden="1" w:unhideWhenUsed="1"/>
+    <w:lsdException w:name="Hashtag" w:semiHidden="1" w:unhideWhenUsed="1"/>
+    <w:lsdException w:name="Unresolved Mention" w:semiHidden="1" w:unhideWhenUsed="1"/>
+    <w:lsdException w:name="Smart Link" w:semiHidden="1" w:unhideWhenUsed="1"/>
   </w:latentStyles>
   <w:style w:type="paragraph" w:default="1" w:styleId="Normal">
     <w:name w:val="Normal"/>
@@ -8381,7 +8498,7 @@
   <a:extraClrSchemeLst/>
   <a:extLst>
     <a:ext uri="{05A4C25C-085E-4340-85A3-A5531E510DB2}">
-      <thm15:themeFamily xmlns:thm15="http://schemas.microsoft.com/office/thememl/2012/main" xmlns="" name="Office Theme" id="{62F939B6-93AF-4DB8-9C6B-D6C7DFDC589F}" vid="{4A3C46E8-61CC-4603-A589-7422A47A8E4A}"/>
+      <thm15:themeFamily xmlns:thm15="http://schemas.microsoft.com/office/thememl/2012/main" name="Office Theme" id="{62F939B6-93AF-4DB8-9C6B-D6C7DFDC589F}" vid="{4A3C46E8-61CC-4603-A589-7422A47A8E4A}"/>
     </a:ext>
   </a:extLst>
 </a:theme>

</xml_diff>